<commit_message>
docs(report): regenerate revised Report 3-6 DOCX
</commit_message>
<xml_diff>
--- a/report/docx/FA26SE182_Report6_PTE-Prep_Software-User-Guides.docx
+++ b/report/docx/FA26SE182_Report6_PTE-Prep_Software-User-Guides.docx
@@ -123,7 +123,7 @@
           <w:color w:val="1F4D78"/>
           <w:sz w:val="30"/>
         </w:rPr>
-        <w:t>PTE Prep</w:t>
+        <w:t>PTEPrep</w:t>
       </w:r>
     </w:p>
     <w:p>
@@ -161,7 +161,7 @@
           <w:color w:val="666666"/>
           <w:sz w:val="20"/>
         </w:rPr>
-        <w:t>Version 1.0 · 06 October 2026</w:t>
+        <w:t>Version 1.1 · 22 October 2026</w:t>
       </w:r>
     </w:p>
     <w:p>
@@ -236,7 +236,7 @@
           <w:i w:val="0"/>
           <w:sz w:val="24"/>
         </w:rPr>
-        <w:t>— Ho Chi Minh City, October 2026 —</w:t>
+        <w:t>— Ho Chi Minh City, 22 October 2026 —</w:t>
       </w:r>
     </w:p>
     <w:sdt>
@@ -352,6 +352,15 @@
           <w:r>
             <w:rPr/>
             <w:t>1.6 Known partial and TBD items</w:t>
+          </w:r>
+        </w:p>
+        <w:p>
+          <w:pPr>
+            <w:pStyle w:val="TOC3"/>
+          </w:pPr>
+          <w:r>
+            <w:rPr/>
+            <w:t>1.7 Scope revision package contents</w:t>
           </w:r>
         </w:p>
         <w:p>
@@ -464,6 +473,15 @@
         </w:p>
         <w:p>
           <w:pPr>
+            <w:pStyle w:val="TOC3"/>
+          </w:pPr>
+          <w:r>
+            <w:rPr/>
+            <w:t>2.12 Student practice and AI prerequisites</w:t>
+          </w:r>
+        </w:p>
+        <w:p>
+          <w:pPr>
             <w:pStyle w:val="TOC2"/>
           </w:pPr>
           <w:r>
@@ -495,7 +513,7 @@
           </w:pPr>
           <w:r>
             <w:rPr/>
-            <w:t>3.3 Platform Author workflows</w:t>
+            <w:t>3.3 Academic Staff workflows</w:t>
           </w:r>
         </w:p>
         <w:p>
@@ -575,6 +593,15 @@
             <w:pStyle w:val="TOC3"/>
           </w:pPr>
           <w:r>
+            <w:rPr/>
+            <w:t>3.12 Scope revision workflows</w:t>
+          </w:r>
+        </w:p>
+        <w:p>
+          <w:pPr>
+            <w:pStyle w:val="TOC3"/>
+          </w:pPr>
+          <w:r>
             <w:rPr>
               <w:color w:val="666666"/>
             </w:rPr>
@@ -926,7 +953,7 @@
               <w:rPr>
                 <w:sz w:val="16"/>
               </w:rPr>
-              <w:t>Ngô Đăng Quang — Project Leader</w:t>
+              <w:t>Ngo Dang Quang - Project Leader</w:t>
             </w:r>
           </w:p>
         </w:tc>
@@ -952,7 +979,7 @@
               <w:rPr>
                 <w:sz w:val="16"/>
               </w:rPr>
-              <w:t>Replaced generic release and guide prompts with project-specific PTE Prep package, installation, verification, troubleshooting, and six-role workflow coverage; preserved the source DOCX section order.</w:t>
+              <w:t>Converted the generic guide template into the first PTEPrep release, installation and user workflow baseline.</w:t>
             </w:r>
           </w:p>
         </w:tc>
@@ -978,7 +1005,168 @@
               <w:rPr>
                 <w:sz w:val="16"/>
               </w:rPr>
-              <w:t>Report 3 SRS, Report 4 design, Report 5 test documentation</w:t>
+              <w:t>Reports 3-5 baseline and original Report 6 template</w:t>
+            </w:r>
+          </w:p>
+        </w:tc>
+      </w:tr>
+      <w:tr>
+        <w:trPr>
+          <w:cantSplit/>
+        </w:trPr>
+        <w:tc>
+          <w:tcPr>
+            <w:tcW w:type="dxa" w:w="1388"/>
+            <w:vAlign w:val="top"/>
+            <w:tcMar>
+              <w:top w:w="70" w:type="dxa"/>
+              <w:start w:w="90" w:type="dxa"/>
+              <w:bottom w:w="70" w:type="dxa"/>
+              <w:end w:w="90" w:type="dxa"/>
+            </w:tcMar>
+          </w:tcPr>
+          <w:p>
+            <w:pPr>
+              <w:spacing w:after="0" w:line="240" w:lineRule="auto"/>
+            </w:pPr>
+            <w:r>
+              <w:rPr/>
+            </w:r>
+            <w:r>
+              <w:rPr>
+                <w:sz w:val="16"/>
+              </w:rPr>
+              <w:t>1.1</w:t>
+            </w:r>
+          </w:p>
+        </w:tc>
+        <w:tc>
+          <w:tcPr>
+            <w:tcW w:type="dxa" w:w="1388"/>
+            <w:vAlign w:val="top"/>
+            <w:tcMar>
+              <w:top w:w="70" w:type="dxa"/>
+              <w:start w:w="90" w:type="dxa"/>
+              <w:bottom w:w="70" w:type="dxa"/>
+              <w:end w:w="90" w:type="dxa"/>
+            </w:tcMar>
+          </w:tcPr>
+          <w:p>
+            <w:pPr>
+              <w:spacing w:after="0" w:line="240" w:lineRule="auto"/>
+            </w:pPr>
+            <w:r>
+              <w:rPr/>
+            </w:r>
+            <w:r>
+              <w:rPr>
+                <w:sz w:val="16"/>
+              </w:rPr>
+              <w:t>2026-10-22</w:t>
+            </w:r>
+          </w:p>
+        </w:tc>
+        <w:tc>
+          <w:tcPr>
+            <w:tcW w:type="dxa" w:w="1893"/>
+            <w:vAlign w:val="top"/>
+            <w:tcMar>
+              <w:top w:w="70" w:type="dxa"/>
+              <w:start w:w="90" w:type="dxa"/>
+              <w:bottom w:w="70" w:type="dxa"/>
+              <w:end w:w="90" w:type="dxa"/>
+            </w:tcMar>
+          </w:tcPr>
+          <w:p>
+            <w:pPr>
+              <w:spacing w:after="0" w:line="240" w:lineRule="auto"/>
+            </w:pPr>
+            <w:r>
+              <w:rPr/>
+            </w:r>
+            <w:r>
+              <w:rPr>
+                <w:sz w:val="16"/>
+              </w:rPr>
+              <w:t>A, M</w:t>
+            </w:r>
+          </w:p>
+        </w:tc>
+        <w:tc>
+          <w:tcPr>
+            <w:tcW w:type="dxa" w:w="1388"/>
+            <w:vAlign w:val="top"/>
+            <w:tcMar>
+              <w:top w:w="70" w:type="dxa"/>
+              <w:start w:w="90" w:type="dxa"/>
+              <w:bottom w:w="70" w:type="dxa"/>
+              <w:end w:w="90" w:type="dxa"/>
+            </w:tcMar>
+          </w:tcPr>
+          <w:p>
+            <w:pPr>
+              <w:spacing w:after="0" w:line="240" w:lineRule="auto"/>
+            </w:pPr>
+            <w:r>
+              <w:rPr/>
+            </w:r>
+            <w:r>
+              <w:rPr>
+                <w:sz w:val="16"/>
+              </w:rPr>
+              <w:t>Ngo Dang Quang - Project Leader</w:t>
+            </w:r>
+          </w:p>
+        </w:tc>
+        <w:tc>
+          <w:tcPr>
+            <w:tcW w:type="dxa" w:w="2272"/>
+            <w:vAlign w:val="top"/>
+            <w:tcMar>
+              <w:top w:w="70" w:type="dxa"/>
+              <w:start w:w="90" w:type="dxa"/>
+              <w:bottom w:w="70" w:type="dxa"/>
+              <w:end w:w="90" w:type="dxa"/>
+            </w:tcMar>
+          </w:tcPr>
+          <w:p>
+            <w:pPr>
+              <w:spacing w:after="0" w:line="240" w:lineRule="auto"/>
+            </w:pPr>
+            <w:r>
+              <w:rPr/>
+            </w:r>
+            <w:r>
+              <w:rPr>
+                <w:sz w:val="16"/>
+              </w:rPr>
+              <w:t>Added Platform Manager, Academic Manager, Academic Staff and Student practice instructions; separated current source behavior from planned AI explanation and channel-flag controls.</w:t>
+            </w:r>
+          </w:p>
+        </w:tc>
+        <w:tc>
+          <w:tcPr>
+            <w:tcW w:type="dxa" w:w="1388"/>
+            <w:vAlign w:val="top"/>
+            <w:tcMar>
+              <w:top w:w="70" w:type="dxa"/>
+              <w:start w:w="90" w:type="dxa"/>
+              <w:bottom w:w="70" w:type="dxa"/>
+              <w:end w:w="90" w:type="dxa"/>
+            </w:tcMar>
+          </w:tcPr>
+          <w:p>
+            <w:pPr>
+              <w:spacing w:after="0" w:line="240" w:lineRule="auto"/>
+            </w:pPr>
+            <w:r>
+              <w:rPr/>
+            </w:r>
+            <w:r>
+              <w:rPr>
+                <w:sz w:val="16"/>
+              </w:rPr>
+              <w:t>Reports 3-5 scope revision</w:t>
             </w:r>
           </w:p>
         </w:tc>
@@ -1022,7 +1210,7 @@
           <w:color w:val="666666"/>
           <w:sz w:val="17"/>
         </w:rPr>
-        <w:t>Product: PTE Prep · Independent organization-based PTE-style practice and mock-exam simulation platform.</w:t>
+        <w:t>Product: PTEPrep · Independent organization-based PTE-style practice and mock-exam simulation platform.</w:t>
       </w:r>
     </w:p>
     <w:p>
@@ -1035,7 +1223,20 @@
           <w:color w:val="666666"/>
           <w:sz w:val="17"/>
         </w:rPr>
-        <w:t>Document baseline: Version 1.0 · Owner: Ngô Đăng Quang — Project Leader · Group: FA26SE182.</w:t>
+        <w:t>Registered title: PTEPrep: An AI-Powered PTE Practice Platform and Realistic Exam Simulator.</w:t>
+      </w:r>
+    </w:p>
+    <w:p>
+      <w:pPr>
+        <w:spacing w:after="80" w:line="240" w:lineRule="auto"/>
+      </w:pPr>
+      <w:r>
+        <w:rPr>
+          <w:i/>
+          <w:color w:val="666666"/>
+          <w:sz w:val="17"/>
+        </w:rPr>
+        <w:t>Document baseline: Version 1.1 · 22 October 2026 · Owner: Ngô Đăng Quang — Project Leader · Group: FA26SE182.</w:t>
       </w:r>
     </w:p>
     <w:p>
@@ -1070,7 +1271,7 @@
         <w:rPr>
           <w:sz w:val="19"/>
         </w:rPr>
-        <w:t>. It defines what the PTE Prep release package contains, how each item is identified, what is supported, and what evidence is still required before a release handoff.</w:t>
+        <w:t>. It defines what the PTEPrep release package contains, how each item is identified, what is supported, and what evidence is still required before a release handoff.</w:t>
       </w:r>
     </w:p>
     <w:p>
@@ -1091,7 +1292,7 @@
         <w:rPr>
           <w:sz w:val="19"/>
         </w:rPr>
-        <w:t>PTE Prep is an independent organization-based PTE-style practice and mock-exam simulation platform. It is not connected to, representative of, endorsed by, or a certification service for PTE Academic. A report produced by PTE Prep is an organization practice/mock result, not an official PTE Academic result.</w:t>
+        <w:t>PTEPrep is an independent organization-based PTE-style practice and mock-exam simulation platform. It is not connected to, representative of, endorsed by, or a certification service for PTE Academic. A report produced by PTEPrep is an organization practice/mock result, not an official PTE Academic result.</w:t>
       </w:r>
     </w:p>
     <w:p>
@@ -1451,7 +1652,7 @@
               <w:rPr>
                 <w:sz w:val="17"/>
               </w:rPr>
-              <w:t>Platform Admin and Platform Author onboarding/content/template/package governance.</w:t>
+              <w:t>Platform Admin, Platform Manager, Academic Manager and Academic Staff organization, operational, content, template and package governance.</w:t>
             </w:r>
           </w:p>
         </w:tc>
@@ -1664,7 +1865,7 @@
               <w:rPr>
                 <w:sz w:val="17"/>
               </w:rPr>
-              <w:t>PTE Prep backend application</w:t>
+              <w:t>PTEPrep backend application</w:t>
             </w:r>
           </w:p>
         </w:tc>
@@ -4155,6 +4356,118 @@
     </w:p>
     <w:p>
       <w:pPr>
+        <w:pStyle w:val="Heading3"/>
+        <w:keepNext/>
+        <w:pageBreakBefore w:val="0"/>
+      </w:pPr>
+      <w:r>
+        <w:t>1.7 Scope revision package contents</w:t>
+      </w:r>
+    </w:p>
+    <w:p>
+      <w:pPr>
+        <w:spacing w:after="80" w:line="240" w:lineRule="auto"/>
+      </w:pPr>
+      <w:r>
+        <w:rPr>
+          <w:sz w:val="19"/>
+        </w:rPr>
+        <w:t>The revised submission package contains four user-facing channels and one shared business backend:</w:t>
+      </w:r>
+    </w:p>
+    <w:p>
+      <w:pPr>
+        <w:pStyle w:val="ListParagraph"/>
+        <w:numPr>
+          <w:ilvl w:val="0"/>
+          <w:numId w:val="18"/>
+        </w:numPr>
+        <w:spacing w:after="40"/>
+      </w:pPr>
+      <w:r>
+        <w:rPr>
+          <w:sz w:val="18"/>
+        </w:rPr>
+        <w:t>Platform administration web for Platform Admin, Platform Manager, Academic Manager and Academic Staff.</w:t>
+      </w:r>
+    </w:p>
+    <w:p>
+      <w:pPr>
+        <w:pStyle w:val="ListParagraph"/>
+        <w:numPr>
+          <w:ilvl w:val="0"/>
+          <w:numId w:val="18"/>
+        </w:numPr>
+        <w:spacing w:after="40"/>
+      </w:pPr>
+      <w:r>
+        <w:rPr>
+          <w:sz w:val="18"/>
+        </w:rPr>
+        <w:t>Organization web for Host, assigned Proctor and assigned Examiner.</w:t>
+      </w:r>
+    </w:p>
+    <w:p>
+      <w:pPr>
+        <w:pStyle w:val="ListParagraph"/>
+        <w:numPr>
+          <w:ilvl w:val="0"/>
+          <w:numId w:val="18"/>
+        </w:numPr>
+        <w:spacing w:after="40"/>
+      </w:pPr>
+      <w:r>
+        <w:rPr>
+          <w:sz w:val="18"/>
+        </w:rPr>
+        <w:t>Student practice web for email sign-in, task catalog, practice sessions, progress and future AI explanations.</w:t>
+      </w:r>
+    </w:p>
+    <w:p>
+      <w:pPr>
+        <w:pStyle w:val="ListParagraph"/>
+        <w:numPr>
+          <w:ilvl w:val="0"/>
+          <w:numId w:val="18"/>
+        </w:numPr>
+        <w:spacing w:after="40"/>
+      </w:pPr>
+      <w:r>
+        <w:rPr>
+          <w:sz w:val="18"/>
+        </w:rPr>
+        <w:t>Windows exam client for assigned organization exams, device checks, timed tasks, local saving, synchronization and submission.</w:t>
+      </w:r>
+    </w:p>
+    <w:p>
+      <w:pPr>
+        <w:pStyle w:val="ListParagraph"/>
+        <w:numPr>
+          <w:ilvl w:val="0"/>
+          <w:numId w:val="18"/>
+        </w:numPr>
+        <w:spacing w:after="40"/>
+      </w:pPr>
+      <w:r>
+        <w:rPr>
+          <w:sz w:val="18"/>
+        </w:rPr>
+        <w:t>Shared reports, diagrams, test cases, evidence records and the later practice implementation gap handoff.</w:t>
+      </w:r>
+    </w:p>
+    <w:p>
+      <w:pPr>
+        <w:spacing w:after="80" w:line="240" w:lineRule="auto"/>
+      </w:pPr>
+      <w:r>
+        <w:rPr>
+          <w:sz w:val="19"/>
+        </w:rPr>
+        <w:t>The package does not include an official PTE Academic connection, Student personal payment, mobile exam delivery, a research-based learning product, or an open chatbot/personalized study-plan engine. AI explanation and channel-specific question flags are included as requirements and design/test handoff items; their current implementation state is labelled rather than implied.</w:t>
+      </w:r>
+    </w:p>
+    <w:p>
+      <w:pPr>
         <w:pStyle w:val="Heading2"/>
         <w:keepNext/>
         <w:pageBreakBefore w:val="0"/>
@@ -4467,7 +4780,7 @@
               <w:rPr>
                 <w:sz w:val="17"/>
               </w:rPr>
-              <w:t>Create/approve Platform Admin/Author access under the identity policy.</w:t>
+              <w:t>Create/approve Platform Admin, Platform Manager, Academic Manager and Academic Staff access under the identity policy.</w:t>
             </w:r>
           </w:p>
         </w:tc>
@@ -7631,7 +7944,7 @@
               <w:rPr>
                 <w:sz w:val="17"/>
               </w:rPr>
-              <w:t>Platform Author</w:t>
+              <w:t>Academic Staff</w:t>
             </w:r>
           </w:p>
         </w:tc>
@@ -7657,7 +7970,7 @@
               <w:rPr>
                 <w:sz w:val="17"/>
               </w:rPr>
-              <w:t>Platform Admin/media owner</w:t>
+              <w:t>Academic Manager for academic review; Platform Admin/media owner for platform support</w:t>
             </w:r>
           </w:p>
         </w:tc>
@@ -8350,6 +8663,106 @@
     </w:p>
     <w:p>
       <w:pPr>
+        <w:pStyle w:val="Heading3"/>
+        <w:keepNext/>
+        <w:pageBreakBefore w:val="0"/>
+      </w:pPr>
+      <w:r>
+        <w:t>2.12 Student practice and AI prerequisites</w:t>
+      </w:r>
+    </w:p>
+    <w:p>
+      <w:pPr>
+        <w:pStyle w:val="Heading4"/>
+        <w:keepNext/>
+        <w:pageBreakBefore w:val="0"/>
+      </w:pPr>
+      <w:r>
+        <w:t>2.12.1 Practice Web prerequisites</w:t>
+      </w:r>
+    </w:p>
+    <w:p>
+      <w:pPr>
+        <w:spacing w:after="80" w:line="240" w:lineRule="auto"/>
+      </w:pPr>
+      <w:r>
+        <w:rPr>
+          <w:b/>
+          <w:i w:val="0"/>
+          <w:sz w:val="19"/>
+        </w:rPr>
+        <w:t>Status: Partial/Planned.</w:t>
+      </w:r>
+      <w:r>
+        <w:rPr>
+          <w:sz w:val="19"/>
+        </w:rPr>
+        <w:t xml:space="preserve"> A practice environment needs the configured Practice Web application, the shared backend API, an accessible database/infrastructure boundary, seeded approved question content, and a valid Student context/entitlement. The question revision must be published, ready and enabled for practice. An exam-only flag is not enough.</w:t>
+      </w:r>
+    </w:p>
+    <w:p>
+      <w:pPr>
+        <w:spacing w:after="80" w:line="240" w:lineRule="auto"/>
+      </w:pPr>
+      <w:r>
+        <w:rPr>
+          <w:sz w:val="19"/>
+        </w:rPr>
+        <w:t>The operator must verify the route and API contract from repository configuration before describing the feature as available. Do not place provider keys, email credentials, database passwords or private URLs in this guide.</w:t>
+      </w:r>
+    </w:p>
+    <w:p>
+      <w:pPr>
+        <w:pStyle w:val="Heading4"/>
+        <w:keepNext/>
+        <w:pageBreakBefore w:val="0"/>
+      </w:pPr>
+      <w:r>
+        <w:t>2.12.2 AI explanation prerequisites</w:t>
+      </w:r>
+    </w:p>
+    <w:p>
+      <w:pPr>
+        <w:spacing w:after="80" w:line="240" w:lineRule="auto"/>
+      </w:pPr>
+      <w:r>
+        <w:rPr>
+          <w:b/>
+          <w:i w:val="0"/>
+          <w:sz w:val="19"/>
+        </w:rPr>
+        <w:t>Status: Planned/Future/TBD.</w:t>
+      </w:r>
+      <w:r>
+        <w:rPr>
+          <w:sz w:val="19"/>
+        </w:rPr>
+        <w:t xml:space="preserve"> The later implementation requires an approved provider adapter, task eligibility list, rubric/prompt version, response correlation, retry policy, data-handling decision and academic review policy. A provider being configured does not prove that explanations are available or correct. When the provider is unavailable, the Student answer and activity record must remain usable.</w:t>
+      </w:r>
+    </w:p>
+    <w:p>
+      <w:pPr>
+        <w:pStyle w:val="Heading4"/>
+        <w:keepNext/>
+        <w:pageBreakBefore w:val="0"/>
+      </w:pPr>
+      <w:r>
+        <w:t>2.12.3 Channel-flag content preparation</w:t>
+      </w:r>
+    </w:p>
+    <w:p>
+      <w:pPr>
+        <w:spacing w:after="80" w:line="240" w:lineRule="auto"/>
+      </w:pPr>
+      <w:r>
+        <w:rPr>
+          <w:sz w:val="19"/>
+        </w:rPr>
+        <w:t>Academic Staff prepares a question revision and selects the intended Practice and/or Exam usage flag. Academic Manager reviews the content, media, rubric and flag choice. The question becomes selectable only after the required publication/readiness state. Later flag changes affect future selection and must not rewrite a frozen session or exam.</w:t>
+      </w:r>
+    </w:p>
+    <w:p>
+      <w:pPr>
         <w:pStyle w:val="Heading2"/>
         <w:keepNext/>
         <w:pageBreakBefore w:val="0"/>
@@ -8380,7 +8793,7 @@
         <w:rPr>
           <w:sz w:val="19"/>
         </w:rPr>
-        <w:t>. It provides role-specific workflows for the six approved human roles. Every workflow records a stable ID, purpose, prerequisites, steps, expected result, error/recovery path, visibility/audit effect, and linked requirements/tests. External Integration Services is described as a service boundary rather than a human manual role.</w:t>
+        <w:t>. It provides role-specific workflows for the eight approved human roles. Every workflow records a stable ID, purpose, prerequisites, steps, expected result, error/recovery path, visibility/audit effect, and linked requirements/tests. External Integration Services is described as a service boundary rather than a human manual role.</w:t>
       </w:r>
     </w:p>
     <w:p>
@@ -8883,7 +9296,7 @@
         <w:rPr>
           <w:sz w:val="19"/>
         </w:rPr>
-        <w:t>The product is independent from PTE Academic and is used for practice/mock-exam simulation. A PTE Prep report is not an official PTE Academic result.</w:t>
+        <w:t>The product is independent from PTE Academic and is used for practice/mock-exam simulation. A PTEPrep report is not an official PTE Academic result.</w:t>
       </w:r>
     </w:p>
     <w:p>
@@ -9263,7 +9676,7 @@
         <w:pageBreakBefore w:val="0"/>
       </w:pPr>
       <w:r>
-        <w:t>`WF-ADMIN-CONTENT-001` — Approve shared question/media content</w:t>
+        <w:t>`WF-ADMIN-PACKAGE-001` — Manage package/license state</w:t>
       </w:r>
     </w:p>
     <w:p>
@@ -9282,7 +9695,7 @@
         <w:rPr>
           <w:sz w:val="19"/>
         </w:rPr>
-        <w:t xml:space="preserve"> Platform Author submitted a draft; required media/status is visible.</w:t>
+        <w:t xml:space="preserve"> Platform Admin has the approved package policy and provider status.</w:t>
       </w:r>
     </w:p>
     <w:p>
@@ -9301,7 +9714,7 @@
         <w:rPr>
           <w:sz w:val="19"/>
         </w:rPr>
-        <w:t xml:space="preserve"> Open draft → inspect task type/content/media → validate required fields → approve/publish or reject with a reason → confirm revision status.</w:t>
+        <w:t xml:space="preserve"> Open package catalog → create/update/activate/retire package definition → review dates/limits/mode → issue/revoke license code where permitted → inspect order/subscription/audit state.</w:t>
       </w:r>
     </w:p>
     <w:p>
@@ -9320,7 +9733,7 @@
         <w:rPr>
           <w:sz w:val="19"/>
         </w:rPr>
-        <w:t xml:space="preserve"> A complete revision becomes available to active templates; an incomplete/rejected revision remains unavailable with a correction reason. Published content is revised rather than overwritten.</w:t>
+        <w:t xml:space="preserve"> Host sees only eligible package/license state and limits. A revoked/expired package cannot authorize a new exam.</w:t>
       </w:r>
     </w:p>
     <w:p>
@@ -9339,26 +9752,7 @@
         <w:rPr>
           <w:sz w:val="19"/>
         </w:rPr>
-        <w:t xml:space="preserve"> Expired media or missing answer/rubric stays non-published. Ask Platform Author to correct and resubmit; do not mark incomplete content active.</w:t>
-      </w:r>
-    </w:p>
-    <w:p>
-      <w:pPr>
-        <w:spacing w:after="80" w:line="240" w:lineRule="auto"/>
-      </w:pPr>
-      <w:r>
-        <w:rPr>
-          <w:b/>
-          <w:i w:val="0"/>
-          <w:sz w:val="19"/>
-        </w:rPr>
-        <w:t>Visibility/audit:</w:t>
-      </w:r>
-      <w:r>
-        <w:rPr>
-          <w:sz w:val="19"/>
-        </w:rPr>
-        <w:t xml:space="preserve"> Platform Author sees draft/rejection; Host sees published selectable content only. Approval/publication/rejection is audited.</w:t>
+        <w:t xml:space="preserve"> Duplicate callback or code redemption returns existing state; do not create a second subscription. Provider failure remains pending/error with correlation.</w:t>
       </w:r>
     </w:p>
     <w:p>
@@ -9386,7 +9780,7 @@
           <w:i w:val="0"/>
           <w:sz w:val="17"/>
         </w:rPr>
-        <w:t>WF-ADMIN-CONTENT-001</w:t>
+        <w:t>WF-ADMIN-PACKAGE-001</w:t>
       </w:r>
       <w:r>
         <w:rPr>
@@ -9401,7 +9795,7 @@
           <w:i w:val="0"/>
           <w:sz w:val="17"/>
         </w:rPr>
-        <w:t>FR-CONTENT-003</w:t>
+        <w:t>FR-PACKAGE-001</w:t>
       </w:r>
       <w:r>
         <w:rPr>
@@ -9416,7 +9810,7 @@
           <w:i w:val="0"/>
           <w:sz w:val="17"/>
         </w:rPr>
-        <w:t>FR-CONTENT-005</w:t>
+        <w:t>FR-PACKAGE-004</w:t>
       </w:r>
       <w:r>
         <w:rPr>
@@ -9431,7 +9825,7 @@
           <w:i w:val="0"/>
           <w:sz w:val="17"/>
         </w:rPr>
-        <w:t>BR-CONTENT-012</w:t>
+        <w:t>BR-PACKAGE-018</w:t>
       </w:r>
       <w:r>
         <w:rPr>
@@ -9446,7 +9840,7 @@
           <w:i w:val="0"/>
           <w:sz w:val="17"/>
         </w:rPr>
-        <w:t>BR-CONTENT-016</w:t>
+        <w:t>BR-PACKAGE-022</w:t>
       </w:r>
       <w:r>
         <w:rPr>
@@ -9461,28 +9855,23 @@
           <w:i w:val="0"/>
           <w:sz w:val="17"/>
         </w:rPr>
-        <w:t>TC-CONTENT-001</w:t>
-      </w:r>
-      <w:r>
-        <w:rPr>
-          <w:sz w:val="19"/>
-        </w:rPr>
-        <w:t>–</w:t>
-      </w:r>
-      <w:r>
-        <w:rPr>
-          <w:rFonts w:ascii="Consolas" w:hAnsi="Consolas"/>
-          <w:b w:val="0"/>
-          <w:i w:val="0"/>
-          <w:sz w:val="17"/>
-        </w:rPr>
-        <w:t>TC-CONTENT-002</w:t>
+        <w:t>TC-PACKAGE-002</w:t>
       </w:r>
       <w:r>
         <w:rPr>
           <w:sz w:val="19"/>
         </w:rPr>
         <w:t>.</w:t>
+      </w:r>
+    </w:p>
+    <w:p>
+      <w:pPr>
+        <w:pStyle w:val="Heading3"/>
+        <w:keepNext/>
+        <w:pageBreakBefore w:val="0"/>
+      </w:pPr>
+      <w:r>
+        <w:t>3.3 Academic Staff workflows</w:t>
       </w:r>
     </w:p>
     <w:p>
@@ -9492,7 +9881,7 @@
         <w:pageBreakBefore w:val="0"/>
       </w:pPr>
       <w:r>
-        <w:t>`WF-ADMIN-PACKAGE-001` — Manage package/license state</w:t>
+        <w:t>`WF-AUTHOR-DRAFT-001` — Create a question/media draft</w:t>
       </w:r>
     </w:p>
     <w:p>
@@ -9511,7 +9900,7 @@
         <w:rPr>
           <w:sz w:val="19"/>
         </w:rPr>
-        <w:t xml:space="preserve"> Platform Admin has the approved package policy and provider status.</w:t>
+        <w:t xml:space="preserve"> Academic Staff has content scope; task catalog row and required media are known.</w:t>
       </w:r>
     </w:p>
     <w:p>
@@ -9530,7 +9919,7 @@
         <w:rPr>
           <w:sz w:val="19"/>
         </w:rPr>
-        <w:t xml:space="preserve"> Open package catalog → create/update/activate/retire package definition → review dates/limits/mode → issue/revoke license code where permitted → inspect order/subscription/audit state.</w:t>
+        <w:t xml:space="preserve"> Open question authoring → choose the catalog task type → enter prompt/response/rubric fields → attach image/audio through the signed media flow → preview → validate → save draft.</w:t>
       </w:r>
     </w:p>
     <w:p>
@@ -9549,7 +9938,7 @@
         <w:rPr>
           <w:sz w:val="19"/>
         </w:rPr>
-        <w:t xml:space="preserve"> Host sees only eligible package/license state and limits. A revoked/expired package cannot authorize a new exam.</w:t>
+        <w:t xml:space="preserve"> Draft has a revision/status, required response form, media completion state, and Score Template compatibility information. It is not production-published by the author.</w:t>
       </w:r>
     </w:p>
     <w:p>
@@ -9568,7 +9957,26 @@
         <w:rPr>
           <w:sz w:val="19"/>
         </w:rPr>
-        <w:t xml:space="preserve"> Duplicate callback or code redemption returns existing state; do not create a second subscription. Provider failure remains pending/error with correlation.</w:t>
+        <w:t xml:space="preserve"> Missing/expired media, invalid response field, or unsupported task combination appears beside the relevant item. Correct and validate again; do not bypass a required media check.</w:t>
+      </w:r>
+    </w:p>
+    <w:p>
+      <w:pPr>
+        <w:spacing w:after="80" w:line="240" w:lineRule="auto"/>
+      </w:pPr>
+      <w:r>
+        <w:rPr>
+          <w:b/>
+          <w:i w:val="0"/>
+          <w:sz w:val="19"/>
+        </w:rPr>
+        <w:t>Visibility/audit:</w:t>
+      </w:r>
+      <w:r>
+        <w:rPr>
+          <w:sz w:val="19"/>
+        </w:rPr>
+        <w:t xml:space="preserve"> Academic Staff sees assigned drafts/revisions; Academic Manager sees submitted drafts for review; Platform Admin sees permitted governance/support data; Host sees only published content. Draft submission and revision actions are auditable.</w:t>
       </w:r>
     </w:p>
     <w:p>
@@ -9596,7 +10004,7 @@
           <w:i w:val="0"/>
           <w:sz w:val="17"/>
         </w:rPr>
-        <w:t>WF-ADMIN-PACKAGE-001</w:t>
+        <w:t>WF-AUTHOR-DRAFT-001</w:t>
       </w:r>
       <w:r>
         <w:rPr>
@@ -9611,7 +10019,7 @@
           <w:i w:val="0"/>
           <w:sz w:val="17"/>
         </w:rPr>
-        <w:t>FR-PACKAGE-001</w:t>
+        <w:t>FR-CONTENT-001</w:t>
       </w:r>
       <w:r>
         <w:rPr>
@@ -9626,7 +10034,7 @@
           <w:i w:val="0"/>
           <w:sz w:val="17"/>
         </w:rPr>
-        <w:t>FR-PACKAGE-004</w:t>
+        <w:t>FR-CONTENT-003</w:t>
       </w:r>
       <w:r>
         <w:rPr>
@@ -9641,13 +10049,13 @@
           <w:i w:val="0"/>
           <w:sz w:val="17"/>
         </w:rPr>
-        <w:t>BR-PACKAGE-018</w:t>
-      </w:r>
-      <w:r>
-        <w:rPr>
-          <w:sz w:val="19"/>
-        </w:rPr>
-        <w:t>–</w:t>
+        <w:t>FR-INTEGRATION-002</w:t>
+      </w:r>
+      <w:r>
+        <w:rPr>
+          <w:sz w:val="19"/>
+        </w:rPr>
+        <w:t xml:space="preserve">, </w:t>
       </w:r>
       <w:r>
         <w:rPr>
@@ -9656,38 +10064,13 @@
           <w:i w:val="0"/>
           <w:sz w:val="17"/>
         </w:rPr>
-        <w:t>BR-PACKAGE-022</w:t>
-      </w:r>
-      <w:r>
-        <w:rPr>
-          <w:sz w:val="19"/>
-        </w:rPr>
-        <w:t xml:space="preserve">, </w:t>
-      </w:r>
-      <w:r>
-        <w:rPr>
-          <w:rFonts w:ascii="Consolas" w:hAnsi="Consolas"/>
-          <w:b w:val="0"/>
-          <w:i w:val="0"/>
-          <w:sz w:val="17"/>
-        </w:rPr>
-        <w:t>TC-PACKAGE-002</w:t>
+        <w:t>TC-CONTENT-001</w:t>
       </w:r>
       <w:r>
         <w:rPr>
           <w:sz w:val="19"/>
         </w:rPr>
         <w:t>.</w:t>
-      </w:r>
-    </w:p>
-    <w:p>
-      <w:pPr>
-        <w:pStyle w:val="Heading3"/>
-        <w:keepNext/>
-        <w:pageBreakBefore w:val="0"/>
-      </w:pPr>
-      <w:r>
-        <w:t>3.3 Platform Author workflows</w:t>
       </w:r>
     </w:p>
     <w:p>
@@ -9697,7 +10080,7 @@
         <w:pageBreakBefore w:val="0"/>
       </w:pPr>
       <w:r>
-        <w:t>`WF-AUTHOR-DRAFT-001` — Create a question/media draft</w:t>
+        <w:t>`WF-AUTHOR-TEMPLATE-001` — Prepare a Score Template draft</w:t>
       </w:r>
     </w:p>
     <w:p>
@@ -9716,7 +10099,7 @@
         <w:rPr>
           <w:sz w:val="19"/>
         </w:rPr>
-        <w:t xml:space="preserve"> Platform Author has content scope; task catalog row and required media are known.</w:t>
+        <w:t xml:space="preserve"> Task rows, section weights, timing, and score-source policy are available.</w:t>
       </w:r>
     </w:p>
     <w:p>
@@ -9735,206 +10118,7 @@
         <w:rPr>
           <w:sz w:val="19"/>
         </w:rPr>
-        <w:t xml:space="preserve"> Open question authoring → choose the catalog task type → enter prompt/response/rubric fields → attach image/audio through the signed media flow → preview → validate → save draft.</w:t>
-      </w:r>
-    </w:p>
-    <w:p>
-      <w:pPr>
-        <w:spacing w:after="80" w:line="240" w:lineRule="auto"/>
-      </w:pPr>
-      <w:r>
-        <w:rPr>
-          <w:b/>
-          <w:i w:val="0"/>
-          <w:sz w:val="19"/>
-        </w:rPr>
-        <w:t>Expected result:</w:t>
-      </w:r>
-      <w:r>
-        <w:rPr>
-          <w:sz w:val="19"/>
-        </w:rPr>
-        <w:t xml:space="preserve"> Draft has a revision/status, required response form, media completion state, and Score Template compatibility information. It is not production-published by the author.</w:t>
-      </w:r>
-    </w:p>
-    <w:p>
-      <w:pPr>
-        <w:spacing w:after="80" w:line="240" w:lineRule="auto"/>
-      </w:pPr>
-      <w:r>
-        <w:rPr>
-          <w:b/>
-          <w:i w:val="0"/>
-          <w:sz w:val="19"/>
-        </w:rPr>
-        <w:t>Error/recovery:</w:t>
-      </w:r>
-      <w:r>
-        <w:rPr>
-          <w:sz w:val="19"/>
-        </w:rPr>
-        <w:t xml:space="preserve"> Missing/expired media, invalid response field, or unsupported task combination appears beside the relevant item. Correct and validate again; do not bypass a required media check.</w:t>
-      </w:r>
-    </w:p>
-    <w:p>
-      <w:pPr>
-        <w:spacing w:after="80" w:line="240" w:lineRule="auto"/>
-      </w:pPr>
-      <w:r>
-        <w:rPr>
-          <w:b/>
-          <w:i w:val="0"/>
-          <w:sz w:val="19"/>
-        </w:rPr>
-        <w:t>Visibility/audit:</w:t>
-      </w:r>
-      <w:r>
-        <w:rPr>
-          <w:sz w:val="19"/>
-        </w:rPr>
-        <w:t xml:space="preserve"> Author sees assigned drafts/revisions; Platform Admin sees submitted drafts; Host sees only published content. Draft submission and revision actions are auditable.</w:t>
-      </w:r>
-    </w:p>
-    <w:p>
-      <w:pPr>
-        <w:spacing w:after="80" w:line="240" w:lineRule="auto"/>
-      </w:pPr>
-      <w:r>
-        <w:rPr>
-          <w:b/>
-          <w:i w:val="0"/>
-          <w:sz w:val="19"/>
-        </w:rPr>
-        <w:t>Traceability:</w:t>
-      </w:r>
-      <w:r>
-        <w:rPr>
-          <w:sz w:val="19"/>
-        </w:rPr>
-        <w:t xml:space="preserve"> </w:t>
-      </w:r>
-      <w:r>
-        <w:rPr>
-          <w:rFonts w:ascii="Consolas" w:hAnsi="Consolas"/>
-          <w:b w:val="0"/>
-          <w:i w:val="0"/>
-          <w:sz w:val="17"/>
-        </w:rPr>
-        <w:t>WF-AUTHOR-DRAFT-001</w:t>
-      </w:r>
-      <w:r>
-        <w:rPr>
-          <w:sz w:val="19"/>
-        </w:rPr>
-        <w:t xml:space="preserve">, </w:t>
-      </w:r>
-      <w:r>
-        <w:rPr>
-          <w:rFonts w:ascii="Consolas" w:hAnsi="Consolas"/>
-          <w:b w:val="0"/>
-          <w:i w:val="0"/>
-          <w:sz w:val="17"/>
-        </w:rPr>
-        <w:t>FR-CONTENT-001</w:t>
-      </w:r>
-      <w:r>
-        <w:rPr>
-          <w:sz w:val="19"/>
-        </w:rPr>
-        <w:t>–</w:t>
-      </w:r>
-      <w:r>
-        <w:rPr>
-          <w:rFonts w:ascii="Consolas" w:hAnsi="Consolas"/>
-          <w:b w:val="0"/>
-          <w:i w:val="0"/>
-          <w:sz w:val="17"/>
-        </w:rPr>
-        <w:t>FR-CONTENT-003</w:t>
-      </w:r>
-      <w:r>
-        <w:rPr>
-          <w:sz w:val="19"/>
-        </w:rPr>
-        <w:t xml:space="preserve">, </w:t>
-      </w:r>
-      <w:r>
-        <w:rPr>
-          <w:rFonts w:ascii="Consolas" w:hAnsi="Consolas"/>
-          <w:b w:val="0"/>
-          <w:i w:val="0"/>
-          <w:sz w:val="17"/>
-        </w:rPr>
-        <w:t>FR-INTEGRATION-002</w:t>
-      </w:r>
-      <w:r>
-        <w:rPr>
-          <w:sz w:val="19"/>
-        </w:rPr>
-        <w:t xml:space="preserve">, </w:t>
-      </w:r>
-      <w:r>
-        <w:rPr>
-          <w:rFonts w:ascii="Consolas" w:hAnsi="Consolas"/>
-          <w:b w:val="0"/>
-          <w:i w:val="0"/>
-          <w:sz w:val="17"/>
-        </w:rPr>
-        <w:t>TC-CONTENT-001</w:t>
-      </w:r>
-      <w:r>
-        <w:rPr>
-          <w:sz w:val="19"/>
-        </w:rPr>
-        <w:t>.</w:t>
-      </w:r>
-    </w:p>
-    <w:p>
-      <w:pPr>
-        <w:pStyle w:val="Heading4"/>
-        <w:keepNext/>
-        <w:pageBreakBefore w:val="0"/>
-      </w:pPr>
-      <w:r>
-        <w:t>`WF-AUTHOR-TEMPLATE-001` — Prepare a Score Template draft</w:t>
-      </w:r>
-    </w:p>
-    <w:p>
-      <w:pPr>
-        <w:spacing w:after="80" w:line="240" w:lineRule="auto"/>
-      </w:pPr>
-      <w:r>
-        <w:rPr>
-          <w:b/>
-          <w:i w:val="0"/>
-          <w:sz w:val="19"/>
-        </w:rPr>
-        <w:t>Prerequisites:</w:t>
-      </w:r>
-      <w:r>
-        <w:rPr>
-          <w:sz w:val="19"/>
-        </w:rPr>
-        <w:t xml:space="preserve"> Task rows, section weights, timing, and score-source policy are available.</w:t>
-      </w:r>
-    </w:p>
-    <w:p>
-      <w:pPr>
-        <w:spacing w:after="80" w:line="240" w:lineRule="auto"/>
-      </w:pPr>
-      <w:r>
-        <w:rPr>
-          <w:b/>
-          <w:i w:val="0"/>
-          <w:sz w:val="19"/>
-        </w:rPr>
-        <w:t>Steps:</w:t>
-      </w:r>
-      <w:r>
-        <w:rPr>
-          <w:sz w:val="19"/>
-        </w:rPr>
-        <w:t xml:space="preserve"> Create template draft → select task rows from the 23-row catalog → specify task count/timing/weight/source eligibility → explicitly mark Personal Introduction unscored when included → validate → submit for Platform Admin approval.</w:t>
+        <w:t xml:space="preserve"> Create template draft → select task rows from the current 23-row vocabulary → specify task count/timing/weight/source eligibility and channel flags → explicitly mark Personal Introduction unscored when included → validate → submit for Academic Manager review.</w:t>
       </w:r>
     </w:p>
     <w:p>
@@ -12508,7 +12692,7 @@
         <w:rPr>
           <w:sz w:val="19"/>
         </w:rPr>
-        <w:t>Check content revision status, required media completion, active Score Template, and approval state. Platform Author corrects the draft; Platform Admin approves/publishes. Host cannot bypass the shared content gate.</w:t>
+        <w:t>Check content revision status, required media completion, active Score Template, and approval state. Academic Staff corrects the draft; Academic Manager reviews/activates under policy, while Platform Admin handles platform governance. Host cannot bypass the shared content gate.</w:t>
       </w:r>
     </w:p>
     <w:p>
@@ -13671,7 +13855,7 @@
         <w:rPr>
           <w:sz w:val="18"/>
         </w:rPr>
-        <w:t>Product is named PTE Prep; PTE Academic independence boundary is visible.</w:t>
+        <w:t>Product is named PTEPrep; PTE Academic independence boundary is visible.</w:t>
       </w:r>
     </w:p>
     <w:p>
@@ -13687,7 +13871,7 @@
         <w:rPr>
           <w:sz w:val="18"/>
         </w:rPr>
-        <w:t>Only Platform Admin, Platform Author, Host, Proctor, Examiner, Student, and External Integration Services appear as product actors.</w:t>
+        <w:t>Only Platform Admin, Platform Manager, Academic Manager, Academic Staff, Host, Proctor, Examiner, Student, and External Integration Services appear as product actors.</w:t>
       </w:r>
     </w:p>
     <w:p>
@@ -13800,6 +13984,1846 @@
           <w:sz w:val="18"/>
         </w:rPr>
         <w:t>Screenshots/assets are masked or explicitly TBD.</w:t>
+      </w:r>
+    </w:p>
+    <w:p>
+      <w:pPr>
+        <w:pStyle w:val="Heading3"/>
+        <w:keepNext/>
+        <w:pageBreakBefore w:val="0"/>
+      </w:pPr>
+      <w:r>
+        <w:t>3.12 Scope revision workflows</w:t>
+      </w:r>
+    </w:p>
+    <w:p>
+      <w:pPr>
+        <w:pStyle w:val="Heading4"/>
+        <w:keepNext/>
+        <w:pageBreakBefore w:val="0"/>
+      </w:pPr>
+      <w:r>
+        <w:t>3.12.1 Platform Manager - operational review</w:t>
+      </w:r>
+    </w:p>
+    <w:p>
+      <w:pPr>
+        <w:spacing w:after="80" w:line="240" w:lineRule="auto"/>
+      </w:pPr>
+      <w:r>
+        <w:rPr>
+          <w:b/>
+          <w:i w:val="0"/>
+          <w:sz w:val="19"/>
+        </w:rPr>
+        <w:t>Workflow ID:</w:t>
+      </w:r>
+      <w:r>
+        <w:rPr>
+          <w:sz w:val="19"/>
+        </w:rPr>
+        <w:t xml:space="preserve"> </w:t>
+      </w:r>
+      <w:r>
+        <w:rPr>
+          <w:rFonts w:ascii="Consolas" w:hAnsi="Consolas"/>
+          <w:b w:val="0"/>
+          <w:i w:val="0"/>
+          <w:sz w:val="17"/>
+        </w:rPr>
+        <w:t>WF-PLATFORM-MANAGER-001</w:t>
+      </w:r>
+      <w:r>
+        <w:rPr>
+          <w:sz w:val="19"/>
+        </w:rPr>
+        <w:t xml:space="preserve"> </w:t>
+      </w:r>
+      <w:r>
+        <w:rPr>
+          <w:b/>
+          <w:i w:val="0"/>
+          <w:sz w:val="19"/>
+        </w:rPr>
+        <w:t>Status:</w:t>
+      </w:r>
+      <w:r>
+        <w:rPr>
+          <w:sz w:val="19"/>
+        </w:rPr>
+        <w:t xml:space="preserve"> Current/Partial depending on the reviewed route.</w:t>
+      </w:r>
+    </w:p>
+    <w:p>
+      <w:pPr>
+        <w:pStyle w:val="ListParagraph"/>
+        <w:numPr>
+          <w:ilvl w:val="0"/>
+          <w:numId w:val="18"/>
+        </w:numPr>
+        <w:spacing w:after="40"/>
+      </w:pPr>
+      <w:r>
+        <w:rPr>
+          <w:sz w:val="18"/>
+        </w:rPr>
+        <w:t>Sign in to the platform administration web.</w:t>
+      </w:r>
+    </w:p>
+    <w:p>
+      <w:pPr>
+        <w:pStyle w:val="ListParagraph"/>
+        <w:numPr>
+          <w:ilvl w:val="0"/>
+          <w:numId w:val="18"/>
+        </w:numPr>
+        <w:spacing w:after="40"/>
+      </w:pPr>
+      <w:r>
+        <w:rPr>
+          <w:sz w:val="18"/>
+        </w:rPr>
+        <w:t>Open the organization or operational case assigned to the Platform Manager.</w:t>
+      </w:r>
+    </w:p>
+    <w:p>
+      <w:pPr>
+        <w:pStyle w:val="ListParagraph"/>
+        <w:numPr>
+          <w:ilvl w:val="0"/>
+          <w:numId w:val="18"/>
+        </w:numPr>
+        <w:spacing w:after="40"/>
+      </w:pPr>
+      <w:r>
+        <w:rPr>
+          <w:sz w:val="18"/>
+        </w:rPr>
+        <w:t>Review status, package/support information and the allowed action.</w:t>
+      </w:r>
+    </w:p>
+    <w:p>
+      <w:pPr>
+        <w:pStyle w:val="ListParagraph"/>
+        <w:numPr>
+          <w:ilvl w:val="0"/>
+          <w:numId w:val="18"/>
+        </w:numPr>
+        <w:spacing w:after="40"/>
+      </w:pPr>
+      <w:r>
+        <w:rPr>
+          <w:sz w:val="18"/>
+        </w:rPr>
+        <w:t>Apply the operational action or escalate it to Platform Admin.</w:t>
+      </w:r>
+    </w:p>
+    <w:p>
+      <w:pPr>
+        <w:pStyle w:val="ListParagraph"/>
+        <w:numPr>
+          <w:ilvl w:val="0"/>
+          <w:numId w:val="18"/>
+        </w:numPr>
+        <w:spacing w:after="40"/>
+      </w:pPr>
+      <w:r>
+        <w:rPr>
+          <w:sz w:val="18"/>
+        </w:rPr>
+        <w:t>Confirm that the resulting status and audit reference are visible.</w:t>
+      </w:r>
+    </w:p>
+    <w:p>
+      <w:pPr>
+        <w:spacing w:after="80" w:line="240" w:lineRule="auto"/>
+      </w:pPr>
+      <w:r>
+        <w:rPr>
+          <w:sz w:val="19"/>
+        </w:rPr>
+        <w:t>The Platform Manager cannot approve academic content, publish a question revision, or read unrelated Student answers.</w:t>
+      </w:r>
+    </w:p>
+    <w:p>
+      <w:pPr>
+        <w:pStyle w:val="Heading4"/>
+        <w:keepNext/>
+        <w:pageBreakBefore w:val="0"/>
+      </w:pPr>
+      <w:r>
+        <w:t>3.12.2 Academic Staff - draft and submit</w:t>
+      </w:r>
+    </w:p>
+    <w:p>
+      <w:pPr>
+        <w:spacing w:after="80" w:line="240" w:lineRule="auto"/>
+      </w:pPr>
+      <w:r>
+        <w:rPr>
+          <w:b/>
+          <w:i w:val="0"/>
+          <w:sz w:val="19"/>
+        </w:rPr>
+        <w:t>Workflow ID:</w:t>
+      </w:r>
+      <w:r>
+        <w:rPr>
+          <w:sz w:val="19"/>
+        </w:rPr>
+        <w:t xml:space="preserve"> </w:t>
+      </w:r>
+      <w:r>
+        <w:rPr>
+          <w:rFonts w:ascii="Consolas" w:hAnsi="Consolas"/>
+          <w:b w:val="0"/>
+          <w:i w:val="0"/>
+          <w:sz w:val="17"/>
+        </w:rPr>
+        <w:t>WF-ACADEMIC-STAFF-001</w:t>
+      </w:r>
+      <w:r>
+        <w:rPr>
+          <w:sz w:val="19"/>
+        </w:rPr>
+        <w:t xml:space="preserve"> </w:t>
+      </w:r>
+      <w:r>
+        <w:rPr>
+          <w:b/>
+          <w:i w:val="0"/>
+          <w:sz w:val="19"/>
+        </w:rPr>
+        <w:t>Status:</w:t>
+      </w:r>
+      <w:r>
+        <w:rPr>
+          <w:sz w:val="19"/>
+        </w:rPr>
+        <w:t xml:space="preserve"> Partial/Planned until the complete authoring and review route is evidenced.</w:t>
+      </w:r>
+    </w:p>
+    <w:p>
+      <w:pPr>
+        <w:pStyle w:val="ListParagraph"/>
+        <w:numPr>
+          <w:ilvl w:val="0"/>
+          <w:numId w:val="18"/>
+        </w:numPr>
+        <w:spacing w:after="40"/>
+      </w:pPr>
+      <w:r>
+        <w:rPr>
+          <w:sz w:val="18"/>
+        </w:rPr>
+        <w:t>Open the content authoring area.</w:t>
+      </w:r>
+    </w:p>
+    <w:p>
+      <w:pPr>
+        <w:pStyle w:val="ListParagraph"/>
+        <w:numPr>
+          <w:ilvl w:val="0"/>
+          <w:numId w:val="18"/>
+        </w:numPr>
+        <w:spacing w:after="40"/>
+      </w:pPr>
+      <w:r>
+        <w:rPr>
+          <w:sz w:val="18"/>
+        </w:rPr>
+        <w:t>Create or revise the question, prompt/media, rubric and task metadata.</w:t>
+      </w:r>
+    </w:p>
+    <w:p>
+      <w:pPr>
+        <w:pStyle w:val="ListParagraph"/>
+        <w:numPr>
+          <w:ilvl w:val="0"/>
+          <w:numId w:val="18"/>
+        </w:numPr>
+        <w:spacing w:after="40"/>
+      </w:pPr>
+      <w:r>
+        <w:rPr>
+          <w:sz w:val="18"/>
+        </w:rPr>
+        <w:t xml:space="preserve">Choose the intended </w:t>
+      </w:r>
+      <w:r>
+        <w:rPr>
+          <w:rFonts w:ascii="Consolas" w:hAnsi="Consolas"/>
+          <w:b w:val="0"/>
+          <w:i w:val="0"/>
+          <w:sz w:val="17"/>
+        </w:rPr>
+        <w:t>available_for_practice</w:t>
+      </w:r>
+      <w:r>
+        <w:rPr>
+          <w:sz w:val="18"/>
+        </w:rPr>
+        <w:t xml:space="preserve"> and </w:t>
+      </w:r>
+      <w:r>
+        <w:rPr>
+          <w:rFonts w:ascii="Consolas" w:hAnsi="Consolas"/>
+          <w:b w:val="0"/>
+          <w:i w:val="0"/>
+          <w:sz w:val="17"/>
+        </w:rPr>
+        <w:t>available_for_exam</w:t>
+      </w:r>
+      <w:r>
+        <w:rPr>
+          <w:sz w:val="18"/>
+        </w:rPr>
+        <w:t xml:space="preserve"> flags.</w:t>
+      </w:r>
+    </w:p>
+    <w:p>
+      <w:pPr>
+        <w:pStyle w:val="ListParagraph"/>
+        <w:numPr>
+          <w:ilvl w:val="0"/>
+          <w:numId w:val="18"/>
+        </w:numPr>
+        <w:spacing w:after="40"/>
+      </w:pPr>
+      <w:r>
+        <w:rPr>
+          <w:sz w:val="18"/>
+        </w:rPr>
+        <w:t>Run the visible content/readiness checks.</w:t>
+      </w:r>
+    </w:p>
+    <w:p>
+      <w:pPr>
+        <w:pStyle w:val="ListParagraph"/>
+        <w:numPr>
+          <w:ilvl w:val="0"/>
+          <w:numId w:val="18"/>
+        </w:numPr>
+        <w:spacing w:after="40"/>
+      </w:pPr>
+      <w:r>
+        <w:rPr>
+          <w:sz w:val="18"/>
+        </w:rPr>
+        <w:t>Submit the revision to Academic Manager with a version and review note.</w:t>
+      </w:r>
+    </w:p>
+    <w:p>
+      <w:pPr>
+        <w:pStyle w:val="ListParagraph"/>
+        <w:numPr>
+          <w:ilvl w:val="0"/>
+          <w:numId w:val="18"/>
+        </w:numPr>
+        <w:spacing w:after="40"/>
+      </w:pPr>
+      <w:r>
+        <w:rPr>
+          <w:sz w:val="18"/>
+        </w:rPr>
+        <w:t>If rejected, address the recorded findings in a new revision; do not edit a locked exam or practice item.</w:t>
+      </w:r>
+    </w:p>
+    <w:p>
+      <w:pPr>
+        <w:spacing w:after="80" w:line="240" w:lineRule="auto"/>
+      </w:pPr>
+      <w:r>
+        <w:rPr>
+          <w:sz w:val="19"/>
+        </w:rPr>
+        <w:t>Academic Staff must not publish or activate its own submitted content.</w:t>
+      </w:r>
+    </w:p>
+    <w:p>
+      <w:pPr>
+        <w:pStyle w:val="Heading4"/>
+        <w:keepNext/>
+        <w:pageBreakBefore w:val="0"/>
+      </w:pPr>
+      <w:r>
+        <w:t>3.12.3 Academic Manager - review and activate</w:t>
+      </w:r>
+    </w:p>
+    <w:p>
+      <w:pPr>
+        <w:spacing w:after="80" w:line="240" w:lineRule="auto"/>
+      </w:pPr>
+      <w:r>
+        <w:rPr>
+          <w:b/>
+          <w:i w:val="0"/>
+          <w:sz w:val="19"/>
+        </w:rPr>
+        <w:t>Workflow ID:</w:t>
+      </w:r>
+      <w:r>
+        <w:rPr>
+          <w:sz w:val="19"/>
+        </w:rPr>
+        <w:t xml:space="preserve"> </w:t>
+      </w:r>
+      <w:r>
+        <w:rPr>
+          <w:rFonts w:ascii="Consolas" w:hAnsi="Consolas"/>
+          <w:b w:val="0"/>
+          <w:i w:val="0"/>
+          <w:sz w:val="17"/>
+        </w:rPr>
+        <w:t>WF-ACADEMIC-MANAGER-001</w:t>
+      </w:r>
+      <w:r>
+        <w:rPr>
+          <w:sz w:val="19"/>
+        </w:rPr>
+        <w:t xml:space="preserve"> </w:t>
+      </w:r>
+      <w:r>
+        <w:rPr>
+          <w:b/>
+          <w:i w:val="0"/>
+          <w:sz w:val="19"/>
+        </w:rPr>
+        <w:t>Status:</w:t>
+      </w:r>
+      <w:r>
+        <w:rPr>
+          <w:sz w:val="19"/>
+        </w:rPr>
+        <w:t xml:space="preserve"> Planned/Future where the reviewed source does not show the complete workflow.</w:t>
+      </w:r>
+    </w:p>
+    <w:p>
+      <w:pPr>
+        <w:pStyle w:val="ListParagraph"/>
+        <w:numPr>
+          <w:ilvl w:val="0"/>
+          <w:numId w:val="18"/>
+        </w:numPr>
+        <w:spacing w:after="40"/>
+      </w:pPr>
+      <w:r>
+        <w:rPr>
+          <w:sz w:val="18"/>
+        </w:rPr>
+        <w:t>Open the submitted revision and inspect task structure, media, rubric, answer policy and channel flags.</w:t>
+      </w:r>
+    </w:p>
+    <w:p>
+      <w:pPr>
+        <w:pStyle w:val="ListParagraph"/>
+        <w:numPr>
+          <w:ilvl w:val="0"/>
+          <w:numId w:val="18"/>
+        </w:numPr>
+        <w:spacing w:after="40"/>
+      </w:pPr>
+      <w:r>
+        <w:rPr>
+          <w:sz w:val="18"/>
+        </w:rPr>
+        <w:t>Approve or reject with a reason.</w:t>
+      </w:r>
+    </w:p>
+    <w:p>
+      <w:pPr>
+        <w:pStyle w:val="ListParagraph"/>
+        <w:numPr>
+          <w:ilvl w:val="0"/>
+          <w:numId w:val="18"/>
+        </w:numPr>
+        <w:spacing w:after="40"/>
+      </w:pPr>
+      <w:r>
+        <w:rPr>
+          <w:sz w:val="18"/>
+        </w:rPr>
+        <w:t>Publish/activate only after all required content and policy checks pass.</w:t>
+      </w:r>
+    </w:p>
+    <w:p>
+      <w:pPr>
+        <w:pStyle w:val="ListParagraph"/>
+        <w:numPr>
+          <w:ilvl w:val="0"/>
+          <w:numId w:val="18"/>
+        </w:numPr>
+        <w:spacing w:after="40"/>
+      </w:pPr>
+      <w:r>
+        <w:rPr>
+          <w:sz w:val="18"/>
+        </w:rPr>
+        <w:t>Confirm the revision status and audit record.</w:t>
+      </w:r>
+    </w:p>
+    <w:p>
+      <w:pPr>
+        <w:pStyle w:val="ListParagraph"/>
+        <w:numPr>
+          <w:ilvl w:val="0"/>
+          <w:numId w:val="18"/>
+        </w:numPr>
+        <w:spacing w:after="40"/>
+      </w:pPr>
+      <w:r>
+        <w:rPr>
+          <w:sz w:val="18"/>
+        </w:rPr>
+        <w:t>Retire or suspend unsafe content without rewriting an existing frozen session or exam.</w:t>
+      </w:r>
+    </w:p>
+    <w:p>
+      <w:pPr>
+        <w:pStyle w:val="Heading4"/>
+        <w:keepNext/>
+        <w:pageBreakBefore w:val="0"/>
+      </w:pPr>
+      <w:r>
+        <w:t>3.12.4 Student - self-practice</w:t>
+      </w:r>
+    </w:p>
+    <w:p>
+      <w:pPr>
+        <w:spacing w:after="80" w:line="240" w:lineRule="auto"/>
+      </w:pPr>
+      <w:r>
+        <w:rPr>
+          <w:b/>
+          <w:i w:val="0"/>
+          <w:sz w:val="19"/>
+        </w:rPr>
+        <w:t>Workflow ID:</w:t>
+      </w:r>
+      <w:r>
+        <w:rPr>
+          <w:sz w:val="19"/>
+        </w:rPr>
+        <w:t xml:space="preserve"> </w:t>
+      </w:r>
+      <w:r>
+        <w:rPr>
+          <w:rFonts w:ascii="Consolas" w:hAnsi="Consolas"/>
+          <w:b w:val="0"/>
+          <w:i w:val="0"/>
+          <w:sz w:val="17"/>
+        </w:rPr>
+        <w:t>WF-STUDENT-PRACTICE-001</w:t>
+      </w:r>
+      <w:r>
+        <w:rPr>
+          <w:sz w:val="19"/>
+        </w:rPr>
+        <w:t xml:space="preserve"> </w:t>
+      </w:r>
+      <w:r>
+        <w:rPr>
+          <w:b/>
+          <w:i w:val="0"/>
+          <w:sz w:val="19"/>
+        </w:rPr>
+        <w:t>Status:</w:t>
+      </w:r>
+      <w:r>
+        <w:rPr>
+          <w:sz w:val="19"/>
+        </w:rPr>
+        <w:t xml:space="preserve"> Partial for current catalog/session/progress slices; AI explanation is Planned/Future.</w:t>
+      </w:r>
+    </w:p>
+    <w:p>
+      <w:pPr>
+        <w:pStyle w:val="ListParagraph"/>
+        <w:numPr>
+          <w:ilvl w:val="0"/>
+          <w:numId w:val="18"/>
+        </w:numPr>
+        <w:spacing w:after="40"/>
+      </w:pPr>
+      <w:r>
+        <w:rPr>
+          <w:sz w:val="18"/>
+        </w:rPr>
+        <w:t xml:space="preserve">Open </w:t>
+      </w:r>
+      <w:r>
+        <w:rPr>
+          <w:rFonts w:ascii="Consolas" w:hAnsi="Consolas"/>
+          <w:b w:val="0"/>
+          <w:i w:val="0"/>
+          <w:sz w:val="17"/>
+        </w:rPr>
+        <w:t>pte-practice</w:t>
+      </w:r>
+      <w:r>
+        <w:rPr>
+          <w:sz w:val="18"/>
+        </w:rPr>
+        <w:t xml:space="preserve"> and request the email sign-in code.</w:t>
+      </w:r>
+    </w:p>
+    <w:p>
+      <w:pPr>
+        <w:pStyle w:val="ListParagraph"/>
+        <w:numPr>
+          <w:ilvl w:val="0"/>
+          <w:numId w:val="18"/>
+        </w:numPr>
+        <w:spacing w:after="40"/>
+      </w:pPr>
+      <w:r>
+        <w:rPr>
+          <w:sz w:val="18"/>
+        </w:rPr>
+        <w:t>Submit the valid code. If it is expired or reused, request a safe resend.</w:t>
+      </w:r>
+    </w:p>
+    <w:p>
+      <w:pPr>
+        <w:pStyle w:val="ListParagraph"/>
+        <w:numPr>
+          <w:ilvl w:val="0"/>
+          <w:numId w:val="18"/>
+        </w:numPr>
+        <w:spacing w:after="40"/>
+      </w:pPr>
+      <w:r>
+        <w:rPr>
+          <w:sz w:val="18"/>
+        </w:rPr>
+        <w:t>Select an authorized organization/context when the product asks for one and confirm that practice entitlement is available.</w:t>
+      </w:r>
+    </w:p>
+    <w:p>
+      <w:pPr>
+        <w:pStyle w:val="ListParagraph"/>
+        <w:numPr>
+          <w:ilvl w:val="0"/>
+          <w:numId w:val="18"/>
+        </w:numPr>
+        <w:spacing w:after="40"/>
+      </w:pPr>
+      <w:r>
+        <w:rPr>
+          <w:sz w:val="18"/>
+        </w:rPr>
+        <w:t>Browse a task group. A visible but unavailable group must explain the missing content, entitlement or readiness condition.</w:t>
+      </w:r>
+    </w:p>
+    <w:p>
+      <w:pPr>
+        <w:pStyle w:val="ListParagraph"/>
+        <w:numPr>
+          <w:ilvl w:val="0"/>
+          <w:numId w:val="18"/>
+        </w:numPr>
+        <w:spacing w:after="40"/>
+      </w:pPr>
+      <w:r>
+        <w:rPr>
+          <w:sz w:val="18"/>
+        </w:rPr>
+        <w:t>Start or resume a practice session. Read the task, timing and save state before answering.</w:t>
+      </w:r>
+    </w:p>
+    <w:p>
+      <w:pPr>
+        <w:pStyle w:val="ListParagraph"/>
+        <w:numPr>
+          <w:ilvl w:val="0"/>
+          <w:numId w:val="18"/>
+        </w:numPr>
+        <w:spacing w:after="40"/>
+      </w:pPr>
+      <w:r>
+        <w:rPr>
+          <w:sz w:val="18"/>
+        </w:rPr>
+        <w:t>Answer, optionally record confidence, and wait for the saved/pending indicator. For speaking/media work, complete the approved grant/upload flow.</w:t>
+      </w:r>
+    </w:p>
+    <w:p>
+      <w:pPr>
+        <w:pStyle w:val="ListParagraph"/>
+        <w:numPr>
+          <w:ilvl w:val="0"/>
+          <w:numId w:val="18"/>
+        </w:numPr>
+        <w:spacing w:after="40"/>
+      </w:pPr>
+      <w:r>
+        <w:rPr>
+          <w:sz w:val="18"/>
+        </w:rPr>
+        <w:t>Use Save and Exit when permitted. Resume the same session rather than starting a duplicate.</w:t>
+      </w:r>
+    </w:p>
+    <w:p>
+      <w:pPr>
+        <w:pStyle w:val="ListParagraph"/>
+        <w:numPr>
+          <w:ilvl w:val="0"/>
+          <w:numId w:val="18"/>
+        </w:numPr>
+        <w:spacing w:after="40"/>
+      </w:pPr>
+      <w:r>
+        <w:rPr>
+          <w:sz w:val="18"/>
+        </w:rPr>
+        <w:t>Submit, skip or discard according to the session policy. Repeated commands should return the existing state.</w:t>
+      </w:r>
+    </w:p>
+    <w:p>
+      <w:pPr>
+        <w:pStyle w:val="ListParagraph"/>
+        <w:numPr>
+          <w:ilvl w:val="0"/>
+          <w:numId w:val="18"/>
+        </w:numPr>
+        <w:spacing w:after="40"/>
+      </w:pPr>
+      <w:r>
+        <w:rPr>
+          <w:sz w:val="18"/>
+        </w:rPr>
+        <w:t>Open Progress/History. Activity and pending feedback are not presented as a final score.</w:t>
+      </w:r>
+    </w:p>
+    <w:p>
+      <w:pPr>
+        <w:pStyle w:val="Heading4"/>
+        <w:keepNext/>
+        <w:pageBreakBefore w:val="0"/>
+      </w:pPr>
+      <w:r>
+        <w:t>3.12.5 Student - AI explanation</w:t>
+      </w:r>
+    </w:p>
+    <w:p>
+      <w:pPr>
+        <w:spacing w:after="80" w:line="240" w:lineRule="auto"/>
+      </w:pPr>
+      <w:r>
+        <w:rPr>
+          <w:b/>
+          <w:i w:val="0"/>
+          <w:sz w:val="19"/>
+        </w:rPr>
+        <w:t>Workflow ID:</w:t>
+      </w:r>
+      <w:r>
+        <w:rPr>
+          <w:sz w:val="19"/>
+        </w:rPr>
+        <w:t xml:space="preserve"> </w:t>
+      </w:r>
+      <w:r>
+        <w:rPr>
+          <w:rFonts w:ascii="Consolas" w:hAnsi="Consolas"/>
+          <w:b w:val="0"/>
+          <w:i w:val="0"/>
+          <w:sz w:val="17"/>
+        </w:rPr>
+        <w:t>WF-STUDENT-PRACTICE-002</w:t>
+      </w:r>
+      <w:r>
+        <w:rPr>
+          <w:sz w:val="19"/>
+        </w:rPr>
+        <w:t xml:space="preserve"> </w:t>
+      </w:r>
+      <w:r>
+        <w:rPr>
+          <w:b/>
+          <w:i w:val="0"/>
+          <w:sz w:val="19"/>
+        </w:rPr>
+        <w:t>Status:</w:t>
+      </w:r>
+      <w:r>
+        <w:rPr>
+          <w:sz w:val="19"/>
+        </w:rPr>
+        <w:t xml:space="preserve"> Planned/Future/TBD.</w:t>
+      </w:r>
+    </w:p>
+    <w:p>
+      <w:pPr>
+        <w:spacing w:after="80" w:line="240" w:lineRule="auto"/>
+      </w:pPr>
+      <w:r>
+        <w:rPr>
+          <w:sz w:val="19"/>
+        </w:rPr>
+        <w:t xml:space="preserve">After a submitted answer, the Student may see </w:t>
+      </w:r>
+      <w:r>
+        <w:rPr>
+          <w:rFonts w:ascii="Consolas" w:hAnsi="Consolas"/>
+          <w:b w:val="0"/>
+          <w:i w:val="0"/>
+          <w:sz w:val="17"/>
+        </w:rPr>
+        <w:t>Pending</w:t>
+      </w:r>
+      <w:r>
+        <w:rPr>
+          <w:sz w:val="19"/>
+        </w:rPr>
+        <w:t xml:space="preserve">, </w:t>
+      </w:r>
+      <w:r>
+        <w:rPr>
+          <w:rFonts w:ascii="Consolas" w:hAnsi="Consolas"/>
+          <w:b w:val="0"/>
+          <w:i w:val="0"/>
+          <w:sz w:val="17"/>
+        </w:rPr>
+        <w:t>Available</w:t>
+      </w:r>
+      <w:r>
+        <w:rPr>
+          <w:sz w:val="19"/>
+        </w:rPr>
+        <w:t xml:space="preserve">, </w:t>
+      </w:r>
+      <w:r>
+        <w:rPr>
+          <w:rFonts w:ascii="Consolas" w:hAnsi="Consolas"/>
+          <w:b w:val="0"/>
+          <w:i w:val="0"/>
+          <w:sz w:val="17"/>
+        </w:rPr>
+        <w:t>Unavailable</w:t>
+      </w:r>
+      <w:r>
+        <w:rPr>
+          <w:sz w:val="19"/>
+        </w:rPr>
+        <w:t xml:space="preserve">, or </w:t>
+      </w:r>
+      <w:r>
+        <w:rPr>
+          <w:rFonts w:ascii="Consolas" w:hAnsi="Consolas"/>
+          <w:b w:val="0"/>
+          <w:i w:val="0"/>
+          <w:sz w:val="17"/>
+        </w:rPr>
+        <w:t>Retry</w:t>
+      </w:r>
+      <w:r>
+        <w:rPr>
+          <w:sz w:val="19"/>
+        </w:rPr>
+        <w:t>. When available, the explanation is labelled as generated educational feedback and identifies the relevant question/rubric context. If it fails, the Student keeps the answer and can follow the retry or support instruction. The guide must not show an invented button or claim a successful AI result until a real UI and dated evidence exist.</w:t>
+      </w:r>
+    </w:p>
+    <w:p>
+      <w:pPr>
+        <w:pStyle w:val="Heading4"/>
+        <w:keepNext/>
+        <w:pageBreakBefore w:val="0"/>
+      </w:pPr>
+      <w:r>
+        <w:t>3.12.6 Student - organization exam reminder</w:t>
+      </w:r>
+    </w:p>
+    <w:p>
+      <w:pPr>
+        <w:spacing w:after="80" w:line="240" w:lineRule="auto"/>
+      </w:pPr>
+      <w:r>
+        <w:rPr>
+          <w:sz w:val="19"/>
+        </w:rPr>
+        <w:t>The self-practice workflow does not replace the Windows organization exam workflow. For an assigned exam, the Student uses the exam code/assignment, completes the device check, follows the fixed timer, saves locally, synchronizes, submits once and later views the Host-published report. Practice flags and exam flags are evaluated by their respective consumers.</w:t>
+      </w:r>
+    </w:p>
+    <w:p>
+      <w:pPr>
+        <w:pStyle w:val="Heading4"/>
+        <w:keepNext/>
+        <w:pageBreakBefore w:val="0"/>
+      </w:pPr>
+      <w:r>
+        <w:t>3.12.7 Scope revision traceability and unresolved feedback</w:t>
+      </w:r>
+    </w:p>
+    <w:tbl>
+      <w:tblPr>
+        <w:tblW w:type="auto" w:w="0"/>
+        <w:jc w:val="center"/>
+        <w:tblLayout w:type="fixed"/>
+        <w:tblLook w:firstColumn="1" w:firstRow="1" w:lastColumn="0" w:lastRow="0" w:noHBand="0" w:noVBand="1" w:val="04A0"/>
+      </w:tblPr>
+      <w:tblGrid>
+        <w:gridCol w:w="3017"/>
+        <w:gridCol w:w="3017"/>
+        <w:gridCol w:w="3017"/>
+      </w:tblGrid>
+      <w:tr>
+        <w:trPr>
+          <w:tblHeader w:val="true"/>
+          <w:cantSplit/>
+        </w:trPr>
+        <w:tc>
+          <w:tcPr>
+            <w:tcW w:type="dxa" w:w="1876"/>
+            <w:vAlign w:val="top"/>
+            <w:tcMar>
+              <w:top w:w="70" w:type="dxa"/>
+              <w:start w:w="90" w:type="dxa"/>
+              <w:bottom w:w="70" w:type="dxa"/>
+              <w:end w:w="90" w:type="dxa"/>
+            </w:tcMar>
+            <w:shd w:val="clear" w:color="auto" w:fill="FFE8E1"/>
+          </w:tcPr>
+          <w:p>
+            <w:pPr>
+              <w:spacing w:after="0" w:line="240" w:lineRule="auto"/>
+            </w:pPr>
+            <w:r>
+              <w:rPr>
+                <w:b/>
+              </w:rPr>
+            </w:r>
+            <w:r>
+              <w:rPr>
+                <w:b/>
+                <w:sz w:val="17"/>
+              </w:rPr>
+              <w:t>Guide topic</w:t>
+            </w:r>
+          </w:p>
+        </w:tc>
+        <w:tc>
+          <w:tcPr>
+            <w:tcW w:type="dxa" w:w="4775"/>
+            <w:vAlign w:val="top"/>
+            <w:tcMar>
+              <w:top w:w="70" w:type="dxa"/>
+              <w:start w:w="90" w:type="dxa"/>
+              <w:bottom w:w="70" w:type="dxa"/>
+              <w:end w:w="90" w:type="dxa"/>
+            </w:tcMar>
+            <w:shd w:val="clear" w:color="auto" w:fill="FFE8E1"/>
+          </w:tcPr>
+          <w:p>
+            <w:pPr>
+              <w:spacing w:after="0" w:line="240" w:lineRule="auto"/>
+            </w:pPr>
+            <w:r>
+              <w:rPr>
+                <w:b/>
+              </w:rPr>
+            </w:r>
+            <w:r>
+              <w:rPr>
+                <w:b/>
+                <w:sz w:val="17"/>
+              </w:rPr>
+              <w:t>Requirement/design/test link</w:t>
+            </w:r>
+          </w:p>
+        </w:tc>
+        <w:tc>
+          <w:tcPr>
+            <w:tcW w:type="dxa" w:w="3070"/>
+            <w:vAlign w:val="top"/>
+            <w:tcMar>
+              <w:top w:w="70" w:type="dxa"/>
+              <w:start w:w="90" w:type="dxa"/>
+              <w:bottom w:w="70" w:type="dxa"/>
+              <w:end w:w="90" w:type="dxa"/>
+            </w:tcMar>
+            <w:shd w:val="clear" w:color="auto" w:fill="FFE8E1"/>
+          </w:tcPr>
+          <w:p>
+            <w:pPr>
+              <w:spacing w:after="0" w:line="240" w:lineRule="auto"/>
+            </w:pPr>
+            <w:r>
+              <w:rPr>
+                <w:b/>
+              </w:rPr>
+            </w:r>
+            <w:r>
+              <w:rPr>
+                <w:b/>
+                <w:sz w:val="17"/>
+              </w:rPr>
+              <w:t>User-facing status</w:t>
+            </w:r>
+          </w:p>
+        </w:tc>
+      </w:tr>
+      <w:tr>
+        <w:trPr>
+          <w:cantSplit/>
+        </w:trPr>
+        <w:tc>
+          <w:tcPr>
+            <w:tcW w:type="dxa" w:w="1876"/>
+            <w:vAlign w:val="top"/>
+            <w:tcMar>
+              <w:top w:w="70" w:type="dxa"/>
+              <w:start w:w="90" w:type="dxa"/>
+              <w:bottom w:w="70" w:type="dxa"/>
+              <w:end w:w="90" w:type="dxa"/>
+            </w:tcMar>
+          </w:tcPr>
+          <w:p>
+            <w:pPr>
+              <w:spacing w:after="0" w:line="240" w:lineRule="auto"/>
+            </w:pPr>
+            <w:r>
+              <w:rPr/>
+            </w:r>
+            <w:r>
+              <w:rPr>
+                <w:sz w:val="17"/>
+              </w:rPr>
+              <w:t>Email sign-in and context</w:t>
+            </w:r>
+          </w:p>
+        </w:tc>
+        <w:tc>
+          <w:tcPr>
+            <w:tcW w:type="dxa" w:w="4775"/>
+            <w:vAlign w:val="top"/>
+            <w:tcMar>
+              <w:top w:w="70" w:type="dxa"/>
+              <w:start w:w="90" w:type="dxa"/>
+              <w:bottom w:w="70" w:type="dxa"/>
+              <w:end w:w="90" w:type="dxa"/>
+            </w:tcMar>
+          </w:tcPr>
+          <w:p>
+            <w:pPr>
+              <w:spacing w:after="0" w:line="240" w:lineRule="auto"/>
+            </w:pPr>
+            <w:r>
+              <w:rPr/>
+            </w:r>
+            <w:r>
+              <w:rPr>
+                <w:rFonts w:ascii="Consolas" w:hAnsi="Consolas"/>
+                <w:b w:val="0"/>
+                <w:i w:val="0"/>
+                <w:sz w:val="17"/>
+              </w:rPr>
+              <w:t>FR-PRACTICE-001</w:t>
+            </w:r>
+            <w:r>
+              <w:rPr>
+                <w:sz w:val="17"/>
+              </w:rPr>
+              <w:t xml:space="preserve">, </w:t>
+            </w:r>
+            <w:r>
+              <w:rPr>
+                <w:rFonts w:ascii="Consolas" w:hAnsi="Consolas"/>
+                <w:b w:val="0"/>
+                <w:i w:val="0"/>
+                <w:sz w:val="17"/>
+              </w:rPr>
+              <w:t>FR-PRACTICE-002</w:t>
+            </w:r>
+            <w:r>
+              <w:rPr>
+                <w:sz w:val="17"/>
+              </w:rPr>
+              <w:t xml:space="preserve">, </w:t>
+            </w:r>
+            <w:r>
+              <w:rPr>
+                <w:rFonts w:ascii="Consolas" w:hAnsi="Consolas"/>
+                <w:b w:val="0"/>
+                <w:i w:val="0"/>
+                <w:sz w:val="17"/>
+              </w:rPr>
+              <w:t>SEQ-PRACTICE-LOGIN</w:t>
+            </w:r>
+            <w:r>
+              <w:rPr>
+                <w:sz w:val="17"/>
+              </w:rPr>
+              <w:t xml:space="preserve">, </w:t>
+            </w:r>
+            <w:r>
+              <w:rPr>
+                <w:rFonts w:ascii="Consolas" w:hAnsi="Consolas"/>
+                <w:b w:val="0"/>
+                <w:i w:val="0"/>
+                <w:sz w:val="17"/>
+              </w:rPr>
+              <w:t>TC-PRACTICE-001</w:t>
+            </w:r>
+            <w:r>
+              <w:rPr>
+                <w:sz w:val="17"/>
+              </w:rPr>
+              <w:t xml:space="preserve">, </w:t>
+            </w:r>
+            <w:r>
+              <w:rPr>
+                <w:rFonts w:ascii="Consolas" w:hAnsi="Consolas"/>
+                <w:b w:val="0"/>
+                <w:i w:val="0"/>
+                <w:sz w:val="17"/>
+              </w:rPr>
+              <w:t>TC-PRACTICE-002</w:t>
+            </w:r>
+          </w:p>
+        </w:tc>
+        <w:tc>
+          <w:tcPr>
+            <w:tcW w:type="dxa" w:w="3070"/>
+            <w:vAlign w:val="top"/>
+            <w:tcMar>
+              <w:top w:w="70" w:type="dxa"/>
+              <w:start w:w="90" w:type="dxa"/>
+              <w:bottom w:w="70" w:type="dxa"/>
+              <w:end w:w="90" w:type="dxa"/>
+            </w:tcMar>
+          </w:tcPr>
+          <w:p>
+            <w:pPr>
+              <w:spacing w:after="0" w:line="240" w:lineRule="auto"/>
+            </w:pPr>
+            <w:r>
+              <w:rPr/>
+            </w:r>
+            <w:r>
+              <w:rPr>
+                <w:sz w:val="17"/>
+              </w:rPr>
+              <w:t>Current/Partial or Planned depending on the verified route</w:t>
+            </w:r>
+          </w:p>
+        </w:tc>
+      </w:tr>
+      <w:tr>
+        <w:trPr>
+          <w:cantSplit/>
+        </w:trPr>
+        <w:tc>
+          <w:tcPr>
+            <w:tcW w:type="dxa" w:w="1876"/>
+            <w:vAlign w:val="top"/>
+            <w:tcMar>
+              <w:top w:w="70" w:type="dxa"/>
+              <w:start w:w="90" w:type="dxa"/>
+              <w:bottom w:w="70" w:type="dxa"/>
+              <w:end w:w="90" w:type="dxa"/>
+            </w:tcMar>
+          </w:tcPr>
+          <w:p>
+            <w:pPr>
+              <w:spacing w:after="0" w:line="240" w:lineRule="auto"/>
+            </w:pPr>
+            <w:r>
+              <w:rPr/>
+            </w:r>
+            <w:r>
+              <w:rPr>
+                <w:sz w:val="17"/>
+              </w:rPr>
+              <w:t>Practice catalog and usage flags</w:t>
+            </w:r>
+          </w:p>
+        </w:tc>
+        <w:tc>
+          <w:tcPr>
+            <w:tcW w:type="dxa" w:w="4775"/>
+            <w:vAlign w:val="top"/>
+            <w:tcMar>
+              <w:top w:w="70" w:type="dxa"/>
+              <w:start w:w="90" w:type="dxa"/>
+              <w:bottom w:w="70" w:type="dxa"/>
+              <w:end w:w="90" w:type="dxa"/>
+            </w:tcMar>
+          </w:tcPr>
+          <w:p>
+            <w:pPr>
+              <w:spacing w:after="0" w:line="240" w:lineRule="auto"/>
+            </w:pPr>
+            <w:r>
+              <w:rPr/>
+            </w:r>
+            <w:r>
+              <w:rPr>
+                <w:rFonts w:ascii="Consolas" w:hAnsi="Consolas"/>
+                <w:b w:val="0"/>
+                <w:i w:val="0"/>
+                <w:sz w:val="17"/>
+              </w:rPr>
+              <w:t>FR-PRACTICE-003</w:t>
+            </w:r>
+            <w:r>
+              <w:rPr>
+                <w:sz w:val="17"/>
+              </w:rPr>
+              <w:t xml:space="preserve">, </w:t>
+            </w:r>
+            <w:r>
+              <w:rPr>
+                <w:rFonts w:ascii="Consolas" w:hAnsi="Consolas"/>
+                <w:b w:val="0"/>
+                <w:i w:val="0"/>
+                <w:sz w:val="17"/>
+              </w:rPr>
+              <w:t>FR-CONTENT-006</w:t>
+            </w:r>
+            <w:r>
+              <w:rPr>
+                <w:sz w:val="17"/>
+              </w:rPr>
+              <w:t xml:space="preserve">, </w:t>
+            </w:r>
+            <w:r>
+              <w:rPr>
+                <w:rFonts w:ascii="Consolas" w:hAnsi="Consolas"/>
+                <w:b w:val="0"/>
+                <w:i w:val="0"/>
+                <w:sz w:val="17"/>
+              </w:rPr>
+              <w:t>TC-PRACTICE-004</w:t>
+            </w:r>
+            <w:r>
+              <w:rPr>
+                <w:sz w:val="17"/>
+              </w:rPr>
+              <w:t xml:space="preserve">, </w:t>
+            </w:r>
+            <w:r>
+              <w:rPr>
+                <w:rFonts w:ascii="Consolas" w:hAnsi="Consolas"/>
+                <w:b w:val="0"/>
+                <w:i w:val="0"/>
+                <w:sz w:val="17"/>
+              </w:rPr>
+              <w:t>TC-CONTENT-003</w:t>
+            </w:r>
+            <w:r>
+              <w:rPr>
+                <w:sz w:val="17"/>
+              </w:rPr>
+              <w:t>-</w:t>
+            </w:r>
+            <w:r>
+              <w:rPr>
+                <w:rFonts w:ascii="Consolas" w:hAnsi="Consolas"/>
+                <w:b w:val="0"/>
+                <w:i w:val="0"/>
+                <w:sz w:val="17"/>
+              </w:rPr>
+              <w:t>006</w:t>
+            </w:r>
+          </w:p>
+        </w:tc>
+        <w:tc>
+          <w:tcPr>
+            <w:tcW w:type="dxa" w:w="3070"/>
+            <w:vAlign w:val="top"/>
+            <w:tcMar>
+              <w:top w:w="70" w:type="dxa"/>
+              <w:start w:w="90" w:type="dxa"/>
+              <w:bottom w:w="70" w:type="dxa"/>
+              <w:end w:w="90" w:type="dxa"/>
+            </w:tcMar>
+          </w:tcPr>
+          <w:p>
+            <w:pPr>
+              <w:spacing w:after="0" w:line="240" w:lineRule="auto"/>
+            </w:pPr>
+            <w:r>
+              <w:rPr/>
+            </w:r>
+            <w:r>
+              <w:rPr>
+                <w:sz w:val="17"/>
+              </w:rPr>
+              <w:t>Flag controls are Planned/Future until the UI is evidenced</w:t>
+            </w:r>
+          </w:p>
+        </w:tc>
+      </w:tr>
+      <w:tr>
+        <w:trPr>
+          <w:cantSplit/>
+        </w:trPr>
+        <w:tc>
+          <w:tcPr>
+            <w:tcW w:type="dxa" w:w="1876"/>
+            <w:vAlign w:val="top"/>
+            <w:tcMar>
+              <w:top w:w="70" w:type="dxa"/>
+              <w:start w:w="90" w:type="dxa"/>
+              <w:bottom w:w="70" w:type="dxa"/>
+              <w:end w:w="90" w:type="dxa"/>
+            </w:tcMar>
+          </w:tcPr>
+          <w:p>
+            <w:pPr>
+              <w:spacing w:after="0" w:line="240" w:lineRule="auto"/>
+            </w:pPr>
+            <w:r>
+              <w:rPr/>
+            </w:r>
+            <w:r>
+              <w:rPr>
+                <w:sz w:val="17"/>
+              </w:rPr>
+              <w:t>Session, answer and media recovery</w:t>
+            </w:r>
+          </w:p>
+        </w:tc>
+        <w:tc>
+          <w:tcPr>
+            <w:tcW w:type="dxa" w:w="4775"/>
+            <w:vAlign w:val="top"/>
+            <w:tcMar>
+              <w:top w:w="70" w:type="dxa"/>
+              <w:start w:w="90" w:type="dxa"/>
+              <w:bottom w:w="70" w:type="dxa"/>
+              <w:end w:w="90" w:type="dxa"/>
+            </w:tcMar>
+          </w:tcPr>
+          <w:p>
+            <w:pPr>
+              <w:spacing w:after="0" w:line="240" w:lineRule="auto"/>
+            </w:pPr>
+            <w:r>
+              <w:rPr/>
+            </w:r>
+            <w:r>
+              <w:rPr>
+                <w:rFonts w:ascii="Consolas" w:hAnsi="Consolas"/>
+                <w:b w:val="0"/>
+                <w:i w:val="0"/>
+                <w:sz w:val="17"/>
+              </w:rPr>
+              <w:t>FR-PRACTICE-004</w:t>
+            </w:r>
+            <w:r>
+              <w:rPr>
+                <w:sz w:val="17"/>
+              </w:rPr>
+              <w:t xml:space="preserve">, </w:t>
+            </w:r>
+            <w:r>
+              <w:rPr>
+                <w:rFonts w:ascii="Consolas" w:hAnsi="Consolas"/>
+                <w:b w:val="0"/>
+                <w:i w:val="0"/>
+                <w:sz w:val="17"/>
+              </w:rPr>
+              <w:t>FR-PRACTICE-005</w:t>
+            </w:r>
+            <w:r>
+              <w:rPr>
+                <w:sz w:val="17"/>
+              </w:rPr>
+              <w:t xml:space="preserve">, </w:t>
+            </w:r>
+            <w:r>
+              <w:rPr>
+                <w:rFonts w:ascii="Consolas" w:hAnsi="Consolas"/>
+                <w:b w:val="0"/>
+                <w:i w:val="0"/>
+                <w:sz w:val="17"/>
+              </w:rPr>
+              <w:t>FR-PRACTICE-006</w:t>
+            </w:r>
+            <w:r>
+              <w:rPr>
+                <w:sz w:val="17"/>
+              </w:rPr>
+              <w:t xml:space="preserve">, </w:t>
+            </w:r>
+            <w:r>
+              <w:rPr>
+                <w:rFonts w:ascii="Consolas" w:hAnsi="Consolas"/>
+                <w:b w:val="0"/>
+                <w:i w:val="0"/>
+                <w:sz w:val="17"/>
+              </w:rPr>
+              <w:t>SEQ-PRACTICE-SESSION</w:t>
+            </w:r>
+            <w:r>
+              <w:rPr>
+                <w:sz w:val="17"/>
+              </w:rPr>
+              <w:t xml:space="preserve">, </w:t>
+            </w:r>
+            <w:r>
+              <w:rPr>
+                <w:rFonts w:ascii="Consolas" w:hAnsi="Consolas"/>
+                <w:b w:val="0"/>
+                <w:i w:val="0"/>
+                <w:sz w:val="17"/>
+              </w:rPr>
+              <w:t>TC-PRACTICE-005</w:t>
+            </w:r>
+            <w:r>
+              <w:rPr>
+                <w:sz w:val="17"/>
+              </w:rPr>
+              <w:t xml:space="preserve"> through </w:t>
+            </w:r>
+            <w:r>
+              <w:rPr>
+                <w:rFonts w:ascii="Consolas" w:hAnsi="Consolas"/>
+                <w:b w:val="0"/>
+                <w:i w:val="0"/>
+                <w:sz w:val="17"/>
+              </w:rPr>
+              <w:t>TC-PRACTICE-009</w:t>
+            </w:r>
+          </w:p>
+        </w:tc>
+        <w:tc>
+          <w:tcPr>
+            <w:tcW w:type="dxa" w:w="3070"/>
+            <w:vAlign w:val="top"/>
+            <w:tcMar>
+              <w:top w:w="70" w:type="dxa"/>
+              <w:start w:w="90" w:type="dxa"/>
+              <w:bottom w:w="70" w:type="dxa"/>
+              <w:end w:w="90" w:type="dxa"/>
+            </w:tcMar>
+          </w:tcPr>
+          <w:p>
+            <w:pPr>
+              <w:spacing w:after="0" w:line="240" w:lineRule="auto"/>
+            </w:pPr>
+            <w:r>
+              <w:rPr/>
+            </w:r>
+            <w:r>
+              <w:rPr>
+                <w:sz w:val="17"/>
+              </w:rPr>
+              <w:t>Current slices and later implementation steps are separated</w:t>
+            </w:r>
+          </w:p>
+        </w:tc>
+      </w:tr>
+      <w:tr>
+        <w:trPr>
+          <w:cantSplit/>
+        </w:trPr>
+        <w:tc>
+          <w:tcPr>
+            <w:tcW w:type="dxa" w:w="1876"/>
+            <w:vAlign w:val="top"/>
+            <w:tcMar>
+              <w:top w:w="70" w:type="dxa"/>
+              <w:start w:w="90" w:type="dxa"/>
+              <w:bottom w:w="70" w:type="dxa"/>
+              <w:end w:w="90" w:type="dxa"/>
+            </w:tcMar>
+          </w:tcPr>
+          <w:p>
+            <w:pPr>
+              <w:spacing w:after="0" w:line="240" w:lineRule="auto"/>
+            </w:pPr>
+            <w:r>
+              <w:rPr/>
+            </w:r>
+            <w:r>
+              <w:rPr>
+                <w:sz w:val="17"/>
+              </w:rPr>
+              <w:t>AI explanation</w:t>
+            </w:r>
+          </w:p>
+        </w:tc>
+        <w:tc>
+          <w:tcPr>
+            <w:tcW w:type="dxa" w:w="4775"/>
+            <w:vAlign w:val="top"/>
+            <w:tcMar>
+              <w:top w:w="70" w:type="dxa"/>
+              <w:start w:w="90" w:type="dxa"/>
+              <w:bottom w:w="70" w:type="dxa"/>
+              <w:end w:w="90" w:type="dxa"/>
+            </w:tcMar>
+          </w:tcPr>
+          <w:p>
+            <w:pPr>
+              <w:spacing w:after="0" w:line="240" w:lineRule="auto"/>
+            </w:pPr>
+            <w:r>
+              <w:rPr/>
+            </w:r>
+            <w:r>
+              <w:rPr>
+                <w:rFonts w:ascii="Consolas" w:hAnsi="Consolas"/>
+                <w:b w:val="0"/>
+                <w:i w:val="0"/>
+                <w:sz w:val="17"/>
+              </w:rPr>
+              <w:t>FR-PRACTICE-007</w:t>
+            </w:r>
+            <w:r>
+              <w:rPr>
+                <w:sz w:val="17"/>
+              </w:rPr>
+              <w:t xml:space="preserve">, </w:t>
+            </w:r>
+            <w:r>
+              <w:rPr>
+                <w:rFonts w:ascii="Consolas" w:hAnsi="Consolas"/>
+                <w:b w:val="0"/>
+                <w:i w:val="0"/>
+                <w:sz w:val="17"/>
+              </w:rPr>
+              <w:t>NFR-AI-001</w:t>
+            </w:r>
+            <w:r>
+              <w:rPr>
+                <w:sz w:val="17"/>
+              </w:rPr>
+              <w:t xml:space="preserve">, </w:t>
+            </w:r>
+            <w:r>
+              <w:rPr>
+                <w:rFonts w:ascii="Consolas" w:hAnsi="Consolas"/>
+                <w:b w:val="0"/>
+                <w:i w:val="0"/>
+                <w:sz w:val="17"/>
+              </w:rPr>
+              <w:t>NFR-AI-002</w:t>
+            </w:r>
+            <w:r>
+              <w:rPr>
+                <w:sz w:val="17"/>
+              </w:rPr>
+              <w:t xml:space="preserve">, </w:t>
+            </w:r>
+            <w:r>
+              <w:rPr>
+                <w:rFonts w:ascii="Consolas" w:hAnsi="Consolas"/>
+                <w:b w:val="0"/>
+                <w:i w:val="0"/>
+                <w:sz w:val="17"/>
+              </w:rPr>
+              <w:t>SEQ-AI-FEEDBACK</w:t>
+            </w:r>
+            <w:r>
+              <w:rPr>
+                <w:sz w:val="17"/>
+              </w:rPr>
+              <w:t xml:space="preserve">, </w:t>
+            </w:r>
+            <w:r>
+              <w:rPr>
+                <w:rFonts w:ascii="Consolas" w:hAnsi="Consolas"/>
+                <w:b w:val="0"/>
+                <w:i w:val="0"/>
+                <w:sz w:val="17"/>
+              </w:rPr>
+              <w:t>TC-PRACTICE-010</w:t>
+            </w:r>
+            <w:r>
+              <w:rPr>
+                <w:sz w:val="17"/>
+              </w:rPr>
+              <w:t xml:space="preserve">, </w:t>
+            </w:r>
+            <w:r>
+              <w:rPr>
+                <w:rFonts w:ascii="Consolas" w:hAnsi="Consolas"/>
+                <w:b w:val="0"/>
+                <w:i w:val="0"/>
+                <w:sz w:val="17"/>
+              </w:rPr>
+              <w:t>TC-PRACTICE-011</w:t>
+            </w:r>
+          </w:p>
+        </w:tc>
+        <w:tc>
+          <w:tcPr>
+            <w:tcW w:type="dxa" w:w="3070"/>
+            <w:vAlign w:val="top"/>
+            <w:tcMar>
+              <w:top w:w="70" w:type="dxa"/>
+              <w:start w:w="90" w:type="dxa"/>
+              <w:bottom w:w="70" w:type="dxa"/>
+              <w:end w:w="90" w:type="dxa"/>
+            </w:tcMar>
+          </w:tcPr>
+          <w:p>
+            <w:pPr>
+              <w:spacing w:after="0" w:line="240" w:lineRule="auto"/>
+            </w:pPr>
+            <w:r>
+              <w:rPr/>
+            </w:r>
+            <w:r>
+              <w:rPr>
+                <w:sz w:val="17"/>
+              </w:rPr>
+              <w:t>Planned/Future/TBD; no invented successful screen</w:t>
+            </w:r>
+          </w:p>
+        </w:tc>
+      </w:tr>
+      <w:tr>
+        <w:trPr>
+          <w:cantSplit/>
+        </w:trPr>
+        <w:tc>
+          <w:tcPr>
+            <w:tcW w:type="dxa" w:w="1876"/>
+            <w:vAlign w:val="top"/>
+            <w:tcMar>
+              <w:top w:w="70" w:type="dxa"/>
+              <w:start w:w="90" w:type="dxa"/>
+              <w:bottom w:w="70" w:type="dxa"/>
+              <w:end w:w="90" w:type="dxa"/>
+            </w:tcMar>
+          </w:tcPr>
+          <w:p>
+            <w:pPr>
+              <w:spacing w:after="0" w:line="240" w:lineRule="auto"/>
+            </w:pPr>
+            <w:r>
+              <w:rPr/>
+            </w:r>
+            <w:r>
+              <w:rPr>
+                <w:sz w:val="17"/>
+              </w:rPr>
+              <w:t>Progress and history</w:t>
+            </w:r>
+          </w:p>
+        </w:tc>
+        <w:tc>
+          <w:tcPr>
+            <w:tcW w:type="dxa" w:w="4775"/>
+            <w:vAlign w:val="top"/>
+            <w:tcMar>
+              <w:top w:w="70" w:type="dxa"/>
+              <w:start w:w="90" w:type="dxa"/>
+              <w:bottom w:w="70" w:type="dxa"/>
+              <w:end w:w="90" w:type="dxa"/>
+            </w:tcMar>
+          </w:tcPr>
+          <w:p>
+            <w:pPr>
+              <w:spacing w:after="0" w:line="240" w:lineRule="auto"/>
+            </w:pPr>
+            <w:r>
+              <w:rPr/>
+            </w:r>
+            <w:r>
+              <w:rPr>
+                <w:rFonts w:ascii="Consolas" w:hAnsi="Consolas"/>
+                <w:b w:val="0"/>
+                <w:i w:val="0"/>
+                <w:sz w:val="17"/>
+              </w:rPr>
+              <w:t>FR-PRACTICE-008</w:t>
+            </w:r>
+            <w:r>
+              <w:rPr>
+                <w:sz w:val="17"/>
+              </w:rPr>
+              <w:t xml:space="preserve">, </w:t>
+            </w:r>
+            <w:r>
+              <w:rPr>
+                <w:rFonts w:ascii="Consolas" w:hAnsi="Consolas"/>
+                <w:b w:val="0"/>
+                <w:i w:val="0"/>
+                <w:sz w:val="17"/>
+              </w:rPr>
+              <w:t>TC-PRACTICE-008</w:t>
+            </w:r>
+            <w:r>
+              <w:rPr>
+                <w:sz w:val="17"/>
+              </w:rPr>
+              <w:t>/</w:t>
+            </w:r>
+            <w:r>
+              <w:rPr>
+                <w:rFonts w:ascii="Consolas" w:hAnsi="Consolas"/>
+                <w:b w:val="0"/>
+                <w:i w:val="0"/>
+                <w:sz w:val="17"/>
+              </w:rPr>
+              <w:t>012</w:t>
+            </w:r>
+          </w:p>
+        </w:tc>
+        <w:tc>
+          <w:tcPr>
+            <w:tcW w:type="dxa" w:w="3070"/>
+            <w:vAlign w:val="top"/>
+            <w:tcMar>
+              <w:top w:w="70" w:type="dxa"/>
+              <w:start w:w="90" w:type="dxa"/>
+              <w:bottom w:w="70" w:type="dxa"/>
+              <w:end w:w="90" w:type="dxa"/>
+            </w:tcMar>
+          </w:tcPr>
+          <w:p>
+            <w:pPr>
+              <w:spacing w:after="0" w:line="240" w:lineRule="auto"/>
+            </w:pPr>
+            <w:r>
+              <w:rPr/>
+            </w:r>
+            <w:r>
+              <w:rPr>
+                <w:sz w:val="17"/>
+              </w:rPr>
+              <w:t>Activity/progress is distinct from a final score</w:t>
+            </w:r>
+          </w:p>
+        </w:tc>
+      </w:tr>
+      <w:tr>
+        <w:trPr>
+          <w:cantSplit/>
+        </w:trPr>
+        <w:tc>
+          <w:tcPr>
+            <w:tcW w:type="dxa" w:w="1876"/>
+            <w:vAlign w:val="top"/>
+            <w:tcMar>
+              <w:top w:w="70" w:type="dxa"/>
+              <w:start w:w="90" w:type="dxa"/>
+              <w:bottom w:w="70" w:type="dxa"/>
+              <w:end w:w="90" w:type="dxa"/>
+            </w:tcMar>
+          </w:tcPr>
+          <w:p>
+            <w:pPr>
+              <w:spacing w:after="0" w:line="240" w:lineRule="auto"/>
+            </w:pPr>
+            <w:r>
+              <w:rPr/>
+            </w:r>
+            <w:r>
+              <w:rPr>
+                <w:sz w:val="17"/>
+              </w:rPr>
+              <w:t>Content feedback</w:t>
+            </w:r>
+          </w:p>
+        </w:tc>
+        <w:tc>
+          <w:tcPr>
+            <w:tcW w:type="dxa" w:w="4775"/>
+            <w:vAlign w:val="top"/>
+            <w:tcMar>
+              <w:top w:w="70" w:type="dxa"/>
+              <w:start w:w="90" w:type="dxa"/>
+              <w:bottom w:w="70" w:type="dxa"/>
+              <w:end w:w="90" w:type="dxa"/>
+            </w:tcMar>
+          </w:tcPr>
+          <w:p>
+            <w:pPr>
+              <w:spacing w:after="0" w:line="240" w:lineRule="auto"/>
+            </w:pPr>
+            <w:r>
+              <w:rPr/>
+            </w:r>
+            <w:r>
+              <w:rPr>
+                <w:rFonts w:ascii="Consolas" w:hAnsi="Consolas"/>
+                <w:b w:val="0"/>
+                <w:i w:val="0"/>
+                <w:sz w:val="17"/>
+              </w:rPr>
+              <w:t>FR-PRACTICE-009</w:t>
+            </w:r>
+            <w:r>
+              <w:rPr>
+                <w:sz w:val="17"/>
+              </w:rPr>
+              <w:t xml:space="preserve">, </w:t>
+            </w:r>
+            <w:r>
+              <w:rPr>
+                <w:rFonts w:ascii="Consolas" w:hAnsi="Consolas"/>
+                <w:b w:val="0"/>
+                <w:i w:val="0"/>
+                <w:sz w:val="17"/>
+              </w:rPr>
+              <w:t>TBD-FEEDBACK-001</w:t>
+            </w:r>
+            <w:r>
+              <w:rPr>
+                <w:sz w:val="17"/>
+              </w:rPr>
+              <w:t xml:space="preserve">, </w:t>
+            </w:r>
+            <w:r>
+              <w:rPr>
+                <w:rFonts w:ascii="Consolas" w:hAnsi="Consolas"/>
+                <w:b w:val="0"/>
+                <w:i w:val="0"/>
+                <w:sz w:val="17"/>
+              </w:rPr>
+              <w:t>TC-PRACTICE-013</w:t>
+            </w:r>
+          </w:p>
+        </w:tc>
+        <w:tc>
+          <w:tcPr>
+            <w:tcW w:type="dxa" w:w="3070"/>
+            <w:vAlign w:val="top"/>
+            <w:tcMar>
+              <w:top w:w="70" w:type="dxa"/>
+              <w:start w:w="90" w:type="dxa"/>
+              <w:bottom w:w="70" w:type="dxa"/>
+              <w:end w:w="90" w:type="dxa"/>
+            </w:tcMar>
+          </w:tcPr>
+          <w:p>
+            <w:pPr>
+              <w:spacing w:after="0" w:line="240" w:lineRule="auto"/>
+            </w:pPr>
+            <w:r>
+              <w:rPr/>
+            </w:r>
+            <w:r>
+              <w:rPr>
+                <w:sz w:val="17"/>
+              </w:rPr>
+              <w:t>Escalation only until reporter, target, handler and visibility are approved</w:t>
+            </w:r>
+          </w:p>
+        </w:tc>
+      </w:tr>
+    </w:tbl>
+    <w:p>
+      <w:pPr>
+        <w:spacing w:after="20"/>
+      </w:pPr>
+    </w:p>
+    <w:p>
+      <w:pPr>
+        <w:spacing w:after="80" w:line="240" w:lineRule="auto"/>
+      </w:pPr>
+      <w:r>
+        <w:rPr>
+          <w:sz w:val="19"/>
+        </w:rPr>
+        <w:t>These references allow a reviewer to move from the user instruction to the requirement, design and planned test without treating a planned step as an available feature.</w:t>
       </w:r>
     </w:p>
     <w:sectPr>

</xml_diff>